<commit_message>
Tactique en section 1 et introduction du BOA comme produit final
- Inversion des sections: 1. Tactique, 2. Technique (sous-sections renumerotees)
- Ajout d'un chapeau a la section Tactique: l'image du produit final vise
  est le BOA
- Mise a jour du sous-titre et de l'introduction du document

Co-Authored-By: Claude Opus 5 <noreply@anthropic.com>
Claude-Session: https://claude.ai/code/session_01MsQTwqEjmEDWzu5z6M6Ayx
</commit_message>
<xml_diff>
--- a/Projet_entrainement.docx
+++ b/Projet_entrainement.docx
@@ -29,7 +29,7 @@
           <w:sz w:val="26"/>
           <w:szCs w:val="26"/>
         </w:rPr>
-        <w:t xml:space="preserve">Technique, tactique et conduite des séances</w:t>
+        <w:t xml:space="preserve">Tactique, technique et conduite des séances</w:t>
       </w:r>
     </w:p>
     <w:p>
@@ -64,17 +64,17 @@
           <w:b/>
           <w:bCs/>
         </w:rPr>
+        <w:t xml:space="preserve">la tactique</w:t>
+      </w:r>
+      <w:r>
+        <w:t xml:space="preserve">, </w:t>
+      </w:r>
+      <w:r>
+        <w:rPr>
+          <w:b/>
+          <w:bCs/>
+        </w:rPr>
         <w:t xml:space="preserve">la technique</w:t>
-      </w:r>
-      <w:r>
-        <w:t xml:space="preserve">, </w:t>
-      </w:r>
-      <w:r>
-        <w:rPr>
-          <w:b/>
-          <w:bCs/>
-        </w:rPr>
-        <w:t xml:space="preserve">la tactique</w:t>
       </w:r>
       <w:r>
         <w:t xml:space="preserve">, </w:t>
@@ -126,7 +126,26 @@
           <w:sz w:val="30"/>
           <w:szCs w:val="30"/>
         </w:rPr>
-        <w:t xml:space="preserve">1. Technique</w:t>
+        <w:t xml:space="preserve">1. Tactique</w:t>
+      </w:r>
+    </w:p>
+    <w:p>
+      <w:pPr>
+        <w:spacing w:after="120" w:before="60" w:line="276"/>
+        <w:jc w:val="both"/>
+      </w:pPr>
+      <w:r>
+        <w:t xml:space="preserve">L’image du produit final que l’on veut atteindre est le </w:t>
+      </w:r>
+      <w:r>
+        <w:rPr>
+          <w:b/>
+          <w:bCs/>
+        </w:rPr>
+        <w:t xml:space="preserve">BOA</w:t>
+      </w:r>
+      <w:r>
+        <w:t xml:space="preserve">. C’est la référence vers laquelle tend l’ensemble du travail : tout ce qui suit sert à y conduire.</w:t>
       </w:r>
     </w:p>
     <w:p>
@@ -142,7 +161,225 @@
           <w:sz w:val="24"/>
           <w:szCs w:val="24"/>
         </w:rPr>
-        <w:t xml:space="preserve">1.1 Principe directeur</w:t>
+        <w:t xml:space="preserve">1.1 Le BOA ascendant</w:t>
+      </w:r>
+    </w:p>
+    <w:p>
+      <w:pPr>
+        <w:spacing w:after="120" w:before="60" w:line="276"/>
+        <w:jc w:val="both"/>
+      </w:pPr>
+      <w:r>
+        <w:t xml:space="preserve">La construction tactique repose sur un </w:t>
+      </w:r>
+      <w:r>
+        <w:rPr>
+          <w:b/>
+          <w:bCs/>
+        </w:rPr>
+        <w:t xml:space="preserve">BOA ascendant</w:t>
+      </w:r>
+      <w:r>
+        <w:t xml:space="preserve"> : une progression qui monte en exigence au fil de la confrontation. Comme en technique, le principe reste de </w:t>
+      </w:r>
+      <w:r>
+        <w:rPr>
+          <w:b/>
+          <w:bCs/>
+        </w:rPr>
+        <w:t xml:space="preserve">ne pas enfermer son plan dans un carcan tactique</w:t>
+      </w:r>
+      <w:r>
+        <w:t xml:space="preserve"> : le plan donne une direction, il ne dicte pas chaque choix.</w:t>
+      </w:r>
+    </w:p>
+    <w:p>
+      <w:pPr>
+        <w:pStyle w:val="Heading2"/>
+        <w:spacing w:after="80" w:before="240"/>
+      </w:pPr>
+      <w:r>
+        <w:rPr>
+          <w:b/>
+          <w:bCs/>
+          <w:color w:val="1F3864"/>
+          <w:sz w:val="24"/>
+          <w:szCs w:val="24"/>
+        </w:rPr>
+        <w:t xml:space="preserve">1.2 L’image de l’arbre</w:t>
+      </w:r>
+    </w:p>
+    <w:p>
+      <w:pPr>
+        <w:spacing w:after="120" w:before="60" w:line="276"/>
+        <w:jc w:val="both"/>
+      </w:pPr>
+      <w:r>
+        <w:t xml:space="preserve">L’</w:t>
+      </w:r>
+      <w:r>
+        <w:rPr>
+          <w:b/>
+          <w:bCs/>
+        </w:rPr>
+        <w:t xml:space="preserve">image de l’arbre</w:t>
+      </w:r>
+      <w:r>
+        <w:t xml:space="preserve"> sert de support de communication : un tronc commun — les principes qui ne bougent pas — et des branches, c’est-à-dire les variantes disponibles selon l’adversaire et le moment. Elle rend visible le fait qu’un même plan autorise plusieurs chemins.</w:t>
+      </w:r>
+    </w:p>
+    <w:p>
+      <w:pPr>
+        <w:pStyle w:val="Heading2"/>
+        <w:spacing w:after="80" w:before="240"/>
+      </w:pPr>
+      <w:r>
+        <w:rPr>
+          <w:b/>
+          <w:bCs/>
+          <w:color w:val="1F3864"/>
+          <w:sz w:val="24"/>
+          <w:szCs w:val="24"/>
+        </w:rPr>
+        <w:t xml:space="preserve">1.3 Les profils</w:t>
+      </w:r>
+    </w:p>
+    <w:p>
+      <w:pPr>
+        <w:spacing w:after="120" w:before="60" w:line="276"/>
+        <w:jc w:val="both"/>
+      </w:pPr>
+      <w:r>
+        <w:t xml:space="preserve">La description du BOA s’appuie sur des profils imagés, faciles à nommer et à reconnaître en situation :</w:t>
+      </w:r>
+    </w:p>
+    <w:p>
+      <w:pPr>
+        <w:pStyle w:val="ListParagraph"/>
+        <w:numPr>
+          <w:ilvl w:val="0"/>
+          <w:numId w:val="2"/>
+        </w:numPr>
+        <w:spacing w:after="50" w:before="50" w:line="264"/>
+      </w:pPr>
+      <w:r>
+        <w:rPr>
+          <w:b/>
+          <w:bCs/>
+        </w:rPr>
+        <w:t xml:space="preserve">Le lion</w:t>
+      </w:r>
+    </w:p>
+    <w:p>
+      <w:pPr>
+        <w:pStyle w:val="ListParagraph"/>
+        <w:numPr>
+          <w:ilvl w:val="0"/>
+          <w:numId w:val="2"/>
+        </w:numPr>
+        <w:spacing w:after="50" w:before="50" w:line="264"/>
+      </w:pPr>
+      <w:r>
+        <w:rPr>
+          <w:b/>
+          <w:bCs/>
+        </w:rPr>
+        <w:t xml:space="preserve">Le magicien</w:t>
+      </w:r>
+    </w:p>
+    <w:p>
+      <w:pPr>
+        <w:pStyle w:val="ListParagraph"/>
+        <w:numPr>
+          <w:ilvl w:val="0"/>
+          <w:numId w:val="2"/>
+        </w:numPr>
+        <w:spacing w:after="50" w:before="50" w:line="264"/>
+      </w:pPr>
+      <w:r>
+        <w:rPr>
+          <w:b/>
+          <w:bCs/>
+        </w:rPr>
+        <w:t xml:space="preserve">La souris</w:t>
+      </w:r>
+    </w:p>
+    <w:p>
+      <w:pPr>
+        <w:pStyle w:val="ListParagraph"/>
+        <w:numPr>
+          <w:ilvl w:val="0"/>
+          <w:numId w:val="2"/>
+        </w:numPr>
+        <w:spacing w:after="50" w:before="50" w:line="264"/>
+      </w:pPr>
+      <w:r>
+        <w:rPr>
+          <w:b/>
+          <w:bCs/>
+        </w:rPr>
+        <w:t xml:space="preserve">Le caméléon</w:t>
+      </w:r>
+    </w:p>
+    <w:p>
+      <w:pPr>
+        <w:pStyle w:val="ListParagraph"/>
+        <w:numPr>
+          <w:ilvl w:val="0"/>
+          <w:numId w:val="2"/>
+        </w:numPr>
+        <w:spacing w:after="50" w:before="50" w:line="264"/>
+      </w:pPr>
+      <w:r>
+        <w:rPr>
+          <w:b/>
+          <w:bCs/>
+        </w:rPr>
+        <w:t xml:space="preserve">Le renard</w:t>
+      </w:r>
+    </w:p>
+    <w:p>
+      <w:pPr>
+        <w:spacing w:after="120" w:before="60" w:line="276"/>
+        <w:jc w:val="both"/>
+      </w:pPr>
+      <w:r>
+        <w:t xml:space="preserve">Chaque profil sera décrit et illustré : comportements caractéristiques, situations où il est pertinent, et réponses à lui opposer.</w:t>
+      </w:r>
+    </w:p>
+    <w:p>
+      <w:pPr>
+        <w:pStyle w:val="Heading1"/>
+        <w:pBdr>
+          <w:bottom w:val="single" w:color="1F3864" w:sz="6" w:space="6"/>
+        </w:pBdr>
+        <w:spacing w:after="160" w:before="380"/>
+      </w:pPr>
+      <w:r>
+        <w:rPr>
+          <w:b/>
+          <w:bCs/>
+          <w:color w:val="1F3864"/>
+          <w:sz w:val="30"/>
+          <w:szCs w:val="30"/>
+        </w:rPr>
+        <w:t xml:space="preserve">2. Technique</w:t>
+      </w:r>
+    </w:p>
+    <w:p>
+      <w:pPr>
+        <w:pStyle w:val="Heading2"/>
+        <w:spacing w:after="80" w:before="240"/>
+      </w:pPr>
+      <w:r>
+        <w:rPr>
+          <w:b/>
+          <w:bCs/>
+          <w:color w:val="1F3864"/>
+          <w:sz w:val="24"/>
+          <w:szCs w:val="24"/>
+        </w:rPr>
+        <w:t xml:space="preserve">2.1 Principe directeur</w:t>
       </w:r>
     </w:p>
     <w:p>
@@ -245,7 +482,7 @@
           <w:sz w:val="24"/>
           <w:szCs w:val="24"/>
         </w:rPr>
-        <w:t xml:space="preserve">1.2 Éléments fondamentaux et apprentissage</w:t>
+        <w:t xml:space="preserve">2.2 Éléments fondamentaux et apprentissage</w:t>
       </w:r>
     </w:p>
     <w:p>
@@ -301,7 +538,7 @@
           <w:sz w:val="24"/>
           <w:szCs w:val="24"/>
         </w:rPr>
-        <w:t xml:space="preserve">1.3 Respecter les lois biomécaniques</w:t>
+        <w:t xml:space="preserve">2.3 Respecter les lois biomécaniques</w:t>
       </w:r>
     </w:p>
     <w:p>
@@ -447,7 +684,7 @@
           <w:sz w:val="24"/>
           <w:szCs w:val="24"/>
         </w:rPr>
-        <w:t xml:space="preserve">1.4 Méthodes et outils</w:t>
+        <w:t xml:space="preserve">2.4 Méthodes et outils</w:t>
       </w:r>
     </w:p>
     <w:p>
@@ -598,224 +835,6 @@
         </w:tc>
       </w:tr>
     </w:tbl>
-    <w:p>
-      <w:pPr>
-        <w:pStyle w:val="Heading1"/>
-        <w:pBdr>
-          <w:bottom w:val="single" w:color="1F3864" w:sz="6" w:space="6"/>
-        </w:pBdr>
-        <w:spacing w:after="160" w:before="380"/>
-      </w:pPr>
-      <w:r>
-        <w:rPr>
-          <w:b/>
-          <w:bCs/>
-          <w:color w:val="1F3864"/>
-          <w:sz w:val="30"/>
-          <w:szCs w:val="30"/>
-        </w:rPr>
-        <w:t xml:space="preserve">2. Tactique</w:t>
-      </w:r>
-    </w:p>
-    <w:p>
-      <w:pPr>
-        <w:pStyle w:val="Heading2"/>
-        <w:spacing w:after="80" w:before="240"/>
-      </w:pPr>
-      <w:r>
-        <w:rPr>
-          <w:b/>
-          <w:bCs/>
-          <w:color w:val="1F3864"/>
-          <w:sz w:val="24"/>
-          <w:szCs w:val="24"/>
-        </w:rPr>
-        <w:t xml:space="preserve">2.1 Le BOA ascendant</w:t>
-      </w:r>
-    </w:p>
-    <w:p>
-      <w:pPr>
-        <w:spacing w:after="120" w:before="60" w:line="276"/>
-        <w:jc w:val="both"/>
-      </w:pPr>
-      <w:r>
-        <w:t xml:space="preserve">La construction tactique repose sur un </w:t>
-      </w:r>
-      <w:r>
-        <w:rPr>
-          <w:b/>
-          <w:bCs/>
-        </w:rPr>
-        <w:t xml:space="preserve">BOA ascendant</w:t>
-      </w:r>
-      <w:r>
-        <w:t xml:space="preserve"> : une progression qui monte en exigence au fil de la confrontation. Comme en technique, le principe reste de </w:t>
-      </w:r>
-      <w:r>
-        <w:rPr>
-          <w:b/>
-          <w:bCs/>
-        </w:rPr>
-        <w:t xml:space="preserve">ne pas enfermer son plan dans un carcan tactique</w:t>
-      </w:r>
-      <w:r>
-        <w:t xml:space="preserve"> : le plan donne une direction, il ne dicte pas chaque choix.</w:t>
-      </w:r>
-    </w:p>
-    <w:p>
-      <w:pPr>
-        <w:pStyle w:val="Heading2"/>
-        <w:spacing w:after="80" w:before="240"/>
-      </w:pPr>
-      <w:r>
-        <w:rPr>
-          <w:b/>
-          <w:bCs/>
-          <w:color w:val="1F3864"/>
-          <w:sz w:val="24"/>
-          <w:szCs w:val="24"/>
-        </w:rPr>
-        <w:t xml:space="preserve">2.2 L’image de l’arbre</w:t>
-      </w:r>
-    </w:p>
-    <w:p>
-      <w:pPr>
-        <w:spacing w:after="120" w:before="60" w:line="276"/>
-        <w:jc w:val="both"/>
-      </w:pPr>
-      <w:r>
-        <w:t xml:space="preserve">L’</w:t>
-      </w:r>
-      <w:r>
-        <w:rPr>
-          <w:b/>
-          <w:bCs/>
-        </w:rPr>
-        <w:t xml:space="preserve">image de l’arbre</w:t>
-      </w:r>
-      <w:r>
-        <w:t xml:space="preserve"> sert de support de communication : un tronc commun — les principes qui ne bougent pas — et des branches, c’est-à-dire les variantes disponibles selon l’adversaire et le moment. Elle rend visible le fait qu’un même plan autorise plusieurs chemins.</w:t>
-      </w:r>
-    </w:p>
-    <w:p>
-      <w:pPr>
-        <w:pStyle w:val="Heading2"/>
-        <w:spacing w:after="80" w:before="240"/>
-      </w:pPr>
-      <w:r>
-        <w:rPr>
-          <w:b/>
-          <w:bCs/>
-          <w:color w:val="1F3864"/>
-          <w:sz w:val="24"/>
-          <w:szCs w:val="24"/>
-        </w:rPr>
-        <w:t xml:space="preserve">2.3 Les profils</w:t>
-      </w:r>
-    </w:p>
-    <w:p>
-      <w:pPr>
-        <w:spacing w:after="120" w:before="60" w:line="276"/>
-        <w:jc w:val="both"/>
-      </w:pPr>
-      <w:r>
-        <w:t xml:space="preserve">La description du BOA s’appuie sur des profils imagés, faciles à nommer et à reconnaître en situation :</w:t>
-      </w:r>
-    </w:p>
-    <w:p>
-      <w:pPr>
-        <w:pStyle w:val="ListParagraph"/>
-        <w:numPr>
-          <w:ilvl w:val="0"/>
-          <w:numId w:val="2"/>
-        </w:numPr>
-        <w:spacing w:after="50" w:before="50" w:line="264"/>
-      </w:pPr>
-      <w:r>
-        <w:rPr>
-          <w:b/>
-          <w:bCs/>
-        </w:rPr>
-        <w:t xml:space="preserve">Le lion</w:t>
-      </w:r>
-    </w:p>
-    <w:p>
-      <w:pPr>
-        <w:pStyle w:val="ListParagraph"/>
-        <w:numPr>
-          <w:ilvl w:val="0"/>
-          <w:numId w:val="2"/>
-        </w:numPr>
-        <w:spacing w:after="50" w:before="50" w:line="264"/>
-      </w:pPr>
-      <w:r>
-        <w:rPr>
-          <w:b/>
-          <w:bCs/>
-        </w:rPr>
-        <w:t xml:space="preserve">Le magicien</w:t>
-      </w:r>
-    </w:p>
-    <w:p>
-      <w:pPr>
-        <w:pStyle w:val="ListParagraph"/>
-        <w:numPr>
-          <w:ilvl w:val="0"/>
-          <w:numId w:val="2"/>
-        </w:numPr>
-        <w:spacing w:after="50" w:before="50" w:line="264"/>
-      </w:pPr>
-      <w:r>
-        <w:rPr>
-          <w:b/>
-          <w:bCs/>
-        </w:rPr>
-        <w:t xml:space="preserve">La souris</w:t>
-      </w:r>
-    </w:p>
-    <w:p>
-      <w:pPr>
-        <w:pStyle w:val="ListParagraph"/>
-        <w:numPr>
-          <w:ilvl w:val="0"/>
-          <w:numId w:val="2"/>
-        </w:numPr>
-        <w:spacing w:after="50" w:before="50" w:line="264"/>
-      </w:pPr>
-      <w:r>
-        <w:rPr>
-          <w:b/>
-          <w:bCs/>
-        </w:rPr>
-        <w:t xml:space="preserve">Le caméléon</w:t>
-      </w:r>
-    </w:p>
-    <w:p>
-      <w:pPr>
-        <w:pStyle w:val="ListParagraph"/>
-        <w:numPr>
-          <w:ilvl w:val="0"/>
-          <w:numId w:val="2"/>
-        </w:numPr>
-        <w:spacing w:after="50" w:before="50" w:line="264"/>
-      </w:pPr>
-      <w:r>
-        <w:rPr>
-          <w:b/>
-          <w:bCs/>
-        </w:rPr>
-        <w:t xml:space="preserve">Le renard</w:t>
-      </w:r>
-    </w:p>
-    <w:p>
-      <w:pPr>
-        <w:spacing w:after="120" w:before="60" w:line="276"/>
-        <w:jc w:val="both"/>
-      </w:pPr>
-      <w:r>
-        <w:t xml:space="preserve">Chaque profil sera décrit et illustré : comportements caractéristiques, situations où il est pertinent, et réponses à lui opposer.</w:t>
-      </w:r>
-    </w:p>
     <w:p>
       <w:pPr>
         <w:pStyle w:val="Heading1"/>

</xml_diff>

<commit_message>
Section tactique: respecter la personnalite de l'enfant
- Nouveau 1.1 "Respecter la personnalite de l'enfant": pas de BOA unique,
  mais des BOA ascendants declines par profil
- Profils corriges: lion, renard, magicien, mur, cameleon
- Reorganisation de la section (1.2 BOA ascendant, 1.3 image de l'arbre,
  1.4 description des profils)

Co-Authored-By: Claude Opus 5 <noreply@anthropic.com>
Claude-Session: https://claude.ai/code/session_01MsQTwqEjmEDWzu5z6M6Ayx
</commit_message>
<xml_diff>
--- a/Projet_entrainement.docx
+++ b/Projet_entrainement.docx
@@ -161,7 +161,7 @@
           <w:sz w:val="24"/>
           <w:szCs w:val="24"/>
         </w:rPr>
-        <w:t xml:space="preserve">1.1 Le BOA ascendant</w:t>
+        <w:t xml:space="preserve">1.1 Respecter la personnalité de l’enfant</w:t>
       </w:r>
     </w:p>
     <w:p>
@@ -170,27 +170,131 @@
         <w:jc w:val="both"/>
       </w:pPr>
       <w:r>
-        <w:t xml:space="preserve">La construction tactique repose sur un </w:t>
-      </w:r>
-      <w:r>
-        <w:rPr>
-          <w:b/>
-          <w:bCs/>
-        </w:rPr>
-        <w:t xml:space="preserve">BOA ascendant</w:t>
-      </w:r>
-      <w:r>
-        <w:t xml:space="preserve"> : une progression qui monte en exigence au fil de la confrontation. Comme en technique, le principe reste de </w:t>
-      </w:r>
-      <w:r>
-        <w:rPr>
-          <w:b/>
-          <w:bCs/>
-        </w:rPr>
-        <w:t xml:space="preserve">ne pas enfermer son plan dans un carcan tactique</w:t>
-      </w:r>
-      <w:r>
-        <w:t xml:space="preserve"> : le plan donne une direction, il ne dicte pas chaque choix.</w:t>
+        <w:t xml:space="preserve">Pour ne pas enfermer l’enfant dans un </w:t>
+      </w:r>
+      <w:r>
+        <w:rPr>
+          <w:b/>
+          <w:bCs/>
+        </w:rPr>
+        <w:t xml:space="preserve">carcan tactique</w:t>
+      </w:r>
+      <w:r>
+        <w:t xml:space="preserve">, il faut </w:t>
+      </w:r>
+      <w:r>
+        <w:rPr>
+          <w:b/>
+          <w:bCs/>
+        </w:rPr>
+        <w:t xml:space="preserve">respecter sa personnalité</w:t>
+      </w:r>
+      <w:r>
+        <w:t xml:space="preserve">. On ne cherche donc pas à construire un BOA unique, valable pour tous, mais à en faire des </w:t>
+      </w:r>
+      <w:r>
+        <w:rPr>
+          <w:b/>
+          <w:bCs/>
+        </w:rPr>
+        <w:t xml:space="preserve">BOA ascendants déclinés selon le profil de chacun</w:t>
+      </w:r>
+      <w:r>
+        <w:t xml:space="preserve"> :</w:t>
+      </w:r>
+    </w:p>
+    <w:p>
+      <w:pPr>
+        <w:pStyle w:val="ListParagraph"/>
+        <w:numPr>
+          <w:ilvl w:val="0"/>
+          <w:numId w:val="2"/>
+        </w:numPr>
+        <w:spacing w:after="50" w:before="50" w:line="264"/>
+      </w:pPr>
+      <w:r>
+        <w:rPr>
+          <w:b/>
+          <w:bCs/>
+        </w:rPr>
+        <w:t xml:space="preserve">Le lion</w:t>
+      </w:r>
+    </w:p>
+    <w:p>
+      <w:pPr>
+        <w:pStyle w:val="ListParagraph"/>
+        <w:numPr>
+          <w:ilvl w:val="0"/>
+          <w:numId w:val="2"/>
+        </w:numPr>
+        <w:spacing w:after="50" w:before="50" w:line="264"/>
+      </w:pPr>
+      <w:r>
+        <w:rPr>
+          <w:b/>
+          <w:bCs/>
+        </w:rPr>
+        <w:t xml:space="preserve">Le renard</w:t>
+      </w:r>
+    </w:p>
+    <w:p>
+      <w:pPr>
+        <w:pStyle w:val="ListParagraph"/>
+        <w:numPr>
+          <w:ilvl w:val="0"/>
+          <w:numId w:val="2"/>
+        </w:numPr>
+        <w:spacing w:after="50" w:before="50" w:line="264"/>
+      </w:pPr>
+      <w:r>
+        <w:rPr>
+          <w:b/>
+          <w:bCs/>
+        </w:rPr>
+        <w:t xml:space="preserve">Le magicien</w:t>
+      </w:r>
+    </w:p>
+    <w:p>
+      <w:pPr>
+        <w:pStyle w:val="ListParagraph"/>
+        <w:numPr>
+          <w:ilvl w:val="0"/>
+          <w:numId w:val="2"/>
+        </w:numPr>
+        <w:spacing w:after="50" w:before="50" w:line="264"/>
+      </w:pPr>
+      <w:r>
+        <w:rPr>
+          <w:b/>
+          <w:bCs/>
+        </w:rPr>
+        <w:t xml:space="preserve">Le mur</w:t>
+      </w:r>
+    </w:p>
+    <w:p>
+      <w:pPr>
+        <w:pStyle w:val="ListParagraph"/>
+        <w:numPr>
+          <w:ilvl w:val="0"/>
+          <w:numId w:val="2"/>
+        </w:numPr>
+        <w:spacing w:after="50" w:before="50" w:line="264"/>
+      </w:pPr>
+      <w:r>
+        <w:rPr>
+          <w:b/>
+          <w:bCs/>
+        </w:rPr>
+        <w:t xml:space="preserve">Le caméléon</w:t>
+      </w:r>
+    </w:p>
+    <w:p>
+      <w:pPr>
+        <w:spacing w:after="120" w:before="60" w:line="276"/>
+        <w:jc w:val="both"/>
+      </w:pPr>
+      <w:r>
+        <w:t xml:space="preserve">Le joueur n’a pas à entrer dans un modèle qui n’est pas le sien : c’est le BOA qui s’ajuste à sa personnalité.</w:t>
       </w:r>
     </w:p>
     <w:p>
@@ -206,7 +310,7 @@
           <w:sz w:val="24"/>
           <w:szCs w:val="24"/>
         </w:rPr>
-        <w:t xml:space="preserve">1.2 L’image de l’arbre</w:t>
+        <w:t xml:space="preserve">1.2 Le BOA ascendant</w:t>
       </w:r>
     </w:p>
     <w:p>
@@ -215,17 +319,17 @@
         <w:jc w:val="both"/>
       </w:pPr>
       <w:r>
-        <w:t xml:space="preserve">L’</w:t>
-      </w:r>
-      <w:r>
-        <w:rPr>
-          <w:b/>
-          <w:bCs/>
-        </w:rPr>
-        <w:t xml:space="preserve">image de l’arbre</w:t>
-      </w:r>
-      <w:r>
-        <w:t xml:space="preserve"> sert de support de communication : un tronc commun — les principes qui ne bougent pas — et des branches, c’est-à-dire les variantes disponibles selon l’adversaire et le moment. Elle rend visible le fait qu’un même plan autorise plusieurs chemins.</w:t>
+        <w:t xml:space="preserve">Quel que soit le profil, la construction tactique reste </w:t>
+      </w:r>
+      <w:r>
+        <w:rPr>
+          <w:b/>
+          <w:bCs/>
+        </w:rPr>
+        <w:t xml:space="preserve">ascendante</w:t>
+      </w:r>
+      <w:r>
+        <w:t xml:space="preserve"> : une progression qui monte en exigence au fil de la confrontation. Le plan donne une direction, il ne dicte pas chaque choix.</w:t>
       </w:r>
     </w:p>
     <w:p>
@@ -241,7 +345,7 @@
           <w:sz w:val="24"/>
           <w:szCs w:val="24"/>
         </w:rPr>
-        <w:t xml:space="preserve">1.3 Les profils</w:t>
+        <w:t xml:space="preserve">1.3 L’image de l’arbre</w:t>
       </w:r>
     </w:p>
     <w:p>
@@ -250,92 +354,33 @@
         <w:jc w:val="both"/>
       </w:pPr>
       <w:r>
-        <w:t xml:space="preserve">La description du BOA s’appuie sur des profils imagés, faciles à nommer et à reconnaître en situation :</w:t>
-      </w:r>
-    </w:p>
-    <w:p>
-      <w:pPr>
-        <w:pStyle w:val="ListParagraph"/>
-        <w:numPr>
-          <w:ilvl w:val="0"/>
-          <w:numId w:val="2"/>
-        </w:numPr>
-        <w:spacing w:after="50" w:before="50" w:line="264"/>
-      </w:pPr>
-      <w:r>
-        <w:rPr>
-          <w:b/>
-          <w:bCs/>
-        </w:rPr>
-        <w:t xml:space="preserve">Le lion</w:t>
-      </w:r>
-    </w:p>
-    <w:p>
-      <w:pPr>
-        <w:pStyle w:val="ListParagraph"/>
-        <w:numPr>
-          <w:ilvl w:val="0"/>
-          <w:numId w:val="2"/>
-        </w:numPr>
-        <w:spacing w:after="50" w:before="50" w:line="264"/>
-      </w:pPr>
-      <w:r>
-        <w:rPr>
-          <w:b/>
-          <w:bCs/>
-        </w:rPr>
-        <w:t xml:space="preserve">Le magicien</w:t>
-      </w:r>
-    </w:p>
-    <w:p>
-      <w:pPr>
-        <w:pStyle w:val="ListParagraph"/>
-        <w:numPr>
-          <w:ilvl w:val="0"/>
-          <w:numId w:val="2"/>
-        </w:numPr>
-        <w:spacing w:after="50" w:before="50" w:line="264"/>
-      </w:pPr>
-      <w:r>
-        <w:rPr>
-          <w:b/>
-          <w:bCs/>
-        </w:rPr>
-        <w:t xml:space="preserve">La souris</w:t>
-      </w:r>
-    </w:p>
-    <w:p>
-      <w:pPr>
-        <w:pStyle w:val="ListParagraph"/>
-        <w:numPr>
-          <w:ilvl w:val="0"/>
-          <w:numId w:val="2"/>
-        </w:numPr>
-        <w:spacing w:after="50" w:before="50" w:line="264"/>
-      </w:pPr>
-      <w:r>
-        <w:rPr>
-          <w:b/>
-          <w:bCs/>
-        </w:rPr>
-        <w:t xml:space="preserve">Le caméléon</w:t>
-      </w:r>
-    </w:p>
-    <w:p>
-      <w:pPr>
-        <w:pStyle w:val="ListParagraph"/>
-        <w:numPr>
-          <w:ilvl w:val="0"/>
-          <w:numId w:val="2"/>
-        </w:numPr>
-        <w:spacing w:after="50" w:before="50" w:line="264"/>
-      </w:pPr>
-      <w:r>
-        <w:rPr>
-          <w:b/>
-          <w:bCs/>
-        </w:rPr>
-        <w:t xml:space="preserve">Le renard</w:t>
+        <w:t xml:space="preserve">L’</w:t>
+      </w:r>
+      <w:r>
+        <w:rPr>
+          <w:b/>
+          <w:bCs/>
+        </w:rPr>
+        <w:t xml:space="preserve">image de l’arbre</w:t>
+      </w:r>
+      <w:r>
+        <w:t xml:space="preserve"> sert de support de communication : un tronc commun — les principes qui ne bougent pas — et des branches, c’est-à-dire les variantes disponibles selon l’adversaire et le moment. Elle rend visible le fait qu’un même plan autorise plusieurs chemins.</w:t>
+      </w:r>
+    </w:p>
+    <w:p>
+      <w:pPr>
+        <w:pStyle w:val="Heading2"/>
+        <w:spacing w:after="80" w:before="240"/>
+      </w:pPr>
+      <w:r>
+        <w:rPr>
+          <w:b/>
+          <w:bCs/>
+          <w:color w:val="1F3864"/>
+          <w:sz w:val="24"/>
+          <w:szCs w:val="24"/>
+        </w:rPr>
+        <w:t xml:space="preserve">1.4 Description des profils</w:t>
       </w:r>
     </w:p>
     <w:p>
@@ -344,7 +389,7 @@
         <w:jc w:val="both"/>
       </w:pPr>
       <w:r>
-        <w:t xml:space="preserve">Chaque profil sera décrit et illustré : comportements caractéristiques, situations où il est pertinent, et réponses à lui opposer.</w:t>
+        <w:t xml:space="preserve">Chaque profil sera décrit et illustré : comportements caractéristiques, situations où il est pertinent, réponses à lui opposer, et forme que prend son BOA ascendant.</w:t>
       </w:r>
     </w:p>
     <w:p>

</xml_diff>

<commit_message>
Ajout d'un tableau de definitions a completer (BOA et profils)
Section 1.4: tableau ouvert avec une ligne par terme (BOA, lion, renard,
magicien, mur, cameleon), cases laissees vides pour remplissage ulterieur.

Co-Authored-By: Claude Opus 5 <noreply@anthropic.com>
Claude-Session: https://claude.ai/code/session_01MsQTwqEjmEDWzu5z6M6Ayx
</commit_message>
<xml_diff>
--- a/Projet_entrainement.docx
+++ b/Projet_entrainement.docx
@@ -380,7 +380,7 @@
           <w:sz w:val="24"/>
           <w:szCs w:val="24"/>
         </w:rPr>
-        <w:t xml:space="preserve">1.4 Description des profils</w:t>
+        <w:t xml:space="preserve">1.4 Définitions — à compléter</w:t>
       </w:r>
     </w:p>
     <w:p>
@@ -389,7 +389,386 @@
         <w:jc w:val="both"/>
       </w:pPr>
       <w:r>
-        <w:t xml:space="preserve">Chaque profil sera décrit et illustré : comportements caractéristiques, situations où il est pertinent, réponses à lui opposer, et forme que prend son BOA ascendant.</w:t>
+        <w:t xml:space="preserve">Chaque terme sera défini et illustré : comportements caractéristiques, situations où le profil est pertinent, réponses à lui opposer, et forme que prend son BOA ascendant. Les définitions restent à écrire.</w:t>
+      </w:r>
+    </w:p>
+    <w:tbl>
+      <w:tblPr>
+        <w:tblW w:type="dxa" w:w="9070"/>
+        <w:tblBorders>
+          <w:top w:val="single" w:color="C9D3E6" w:sz="2"/>
+          <w:left w:val="single" w:color="C9D3E6" w:sz="2"/>
+          <w:bottom w:val="single" w:color="C9D3E6" w:sz="2"/>
+          <w:right w:val="single" w:color="C9D3E6" w:sz="2"/>
+          <w:insideH w:val="single" w:color="C9D3E6" w:sz="2"/>
+          <w:insideV w:val="single" w:color="C9D3E6" w:sz="2"/>
+        </w:tblBorders>
+      </w:tblPr>
+      <w:tblGrid>
+        <w:gridCol w:w="2400"/>
+        <w:gridCol w:w="6670"/>
+      </w:tblGrid>
+      <w:tr>
+        <w:tc>
+          <w:tcPr>
+            <w:tcW w:type="dxa" w:w="2400"/>
+            <w:shd w:fill="F2F5FA" w:color="auto" w:val="clear"/>
+            <w:tcMar>
+              <w:top w:type="dxa" w:w="160"/>
+              <w:left w:type="dxa" w:w="160"/>
+              <w:bottom w:type="dxa" w:w="160"/>
+              <w:right w:type="dxa" w:w="120"/>
+            </w:tcMar>
+          </w:tcPr>
+          <w:p>
+            <w:r>
+              <w:rPr>
+                <w:b/>
+                <w:bCs/>
+                <w:color w:val="1F3864"/>
+                <w:sz w:val="22"/>
+                <w:szCs w:val="22"/>
+              </w:rPr>
+              <w:t xml:space="preserve">Le BOA</w:t>
+            </w:r>
+          </w:p>
+        </w:tc>
+        <w:tc>
+          <w:tcPr>
+            <w:tcW w:type="dxa" w:w="6670"/>
+            <w:tcMar>
+              <w:top w:type="dxa" w:w="160"/>
+              <w:left w:type="dxa" w:w="160"/>
+              <w:bottom w:type="dxa" w:w="160"/>
+              <w:right w:type="dxa" w:w="160"/>
+            </w:tcMar>
+          </w:tcPr>
+          <w:p>
+            <w:r>
+              <w:rPr>
+                <w:i/>
+                <w:iCs/>
+                <w:color w:val="8C8C8C"/>
+                <w:sz w:val="19"/>
+                <w:szCs w:val="19"/>
+              </w:rPr>
+              <w:t xml:space="preserve">À compléter — définition générale et ce que recouvre le sigle.</w:t>
+            </w:r>
+          </w:p>
+          <w:p>
+            <w:r>
+              <w:t xml:space="preserve"/>
+            </w:r>
+          </w:p>
+          <w:p>
+            <w:r>
+              <w:t xml:space="preserve"/>
+            </w:r>
+          </w:p>
+        </w:tc>
+      </w:tr>
+      <w:tr>
+        <w:tc>
+          <w:tcPr>
+            <w:tcW w:type="dxa" w:w="2400"/>
+            <w:shd w:fill="F2F5FA" w:color="auto" w:val="clear"/>
+            <w:tcMar>
+              <w:top w:type="dxa" w:w="160"/>
+              <w:left w:type="dxa" w:w="160"/>
+              <w:bottom w:type="dxa" w:w="160"/>
+              <w:right w:type="dxa" w:w="120"/>
+            </w:tcMar>
+          </w:tcPr>
+          <w:p>
+            <w:r>
+              <w:rPr>
+                <w:b/>
+                <w:bCs/>
+                <w:color w:val="1F3864"/>
+                <w:sz w:val="22"/>
+                <w:szCs w:val="22"/>
+              </w:rPr>
+              <w:t xml:space="preserve">Le lion</w:t>
+            </w:r>
+          </w:p>
+        </w:tc>
+        <w:tc>
+          <w:tcPr>
+            <w:tcW w:type="dxa" w:w="6670"/>
+            <w:tcMar>
+              <w:top w:type="dxa" w:w="160"/>
+              <w:left w:type="dxa" w:w="160"/>
+              <w:bottom w:type="dxa" w:w="160"/>
+              <w:right w:type="dxa" w:w="160"/>
+            </w:tcMar>
+          </w:tcPr>
+          <w:p>
+            <w:r>
+              <w:rPr>
+                <w:i/>
+                <w:iCs/>
+                <w:color w:val="8C8C8C"/>
+                <w:sz w:val="19"/>
+                <w:szCs w:val="19"/>
+              </w:rPr>
+              <w:t xml:space="preserve">À compléter.</w:t>
+            </w:r>
+          </w:p>
+          <w:p>
+            <w:r>
+              <w:t xml:space="preserve"/>
+            </w:r>
+          </w:p>
+          <w:p>
+            <w:r>
+              <w:t xml:space="preserve"/>
+            </w:r>
+          </w:p>
+        </w:tc>
+      </w:tr>
+      <w:tr>
+        <w:tc>
+          <w:tcPr>
+            <w:tcW w:type="dxa" w:w="2400"/>
+            <w:shd w:fill="F2F5FA" w:color="auto" w:val="clear"/>
+            <w:tcMar>
+              <w:top w:type="dxa" w:w="160"/>
+              <w:left w:type="dxa" w:w="160"/>
+              <w:bottom w:type="dxa" w:w="160"/>
+              <w:right w:type="dxa" w:w="120"/>
+            </w:tcMar>
+          </w:tcPr>
+          <w:p>
+            <w:r>
+              <w:rPr>
+                <w:b/>
+                <w:bCs/>
+                <w:color w:val="1F3864"/>
+                <w:sz w:val="22"/>
+                <w:szCs w:val="22"/>
+              </w:rPr>
+              <w:t xml:space="preserve">Le renard</w:t>
+            </w:r>
+          </w:p>
+        </w:tc>
+        <w:tc>
+          <w:tcPr>
+            <w:tcW w:type="dxa" w:w="6670"/>
+            <w:tcMar>
+              <w:top w:type="dxa" w:w="160"/>
+              <w:left w:type="dxa" w:w="160"/>
+              <w:bottom w:type="dxa" w:w="160"/>
+              <w:right w:type="dxa" w:w="160"/>
+            </w:tcMar>
+          </w:tcPr>
+          <w:p>
+            <w:r>
+              <w:rPr>
+                <w:i/>
+                <w:iCs/>
+                <w:color w:val="8C8C8C"/>
+                <w:sz w:val="19"/>
+                <w:szCs w:val="19"/>
+              </w:rPr>
+              <w:t xml:space="preserve">À compléter.</w:t>
+            </w:r>
+          </w:p>
+          <w:p>
+            <w:r>
+              <w:t xml:space="preserve"/>
+            </w:r>
+          </w:p>
+          <w:p>
+            <w:r>
+              <w:t xml:space="preserve"/>
+            </w:r>
+          </w:p>
+        </w:tc>
+      </w:tr>
+      <w:tr>
+        <w:tc>
+          <w:tcPr>
+            <w:tcW w:type="dxa" w:w="2400"/>
+            <w:shd w:fill="F2F5FA" w:color="auto" w:val="clear"/>
+            <w:tcMar>
+              <w:top w:type="dxa" w:w="160"/>
+              <w:left w:type="dxa" w:w="160"/>
+              <w:bottom w:type="dxa" w:w="160"/>
+              <w:right w:type="dxa" w:w="120"/>
+            </w:tcMar>
+          </w:tcPr>
+          <w:p>
+            <w:r>
+              <w:rPr>
+                <w:b/>
+                <w:bCs/>
+                <w:color w:val="1F3864"/>
+                <w:sz w:val="22"/>
+                <w:szCs w:val="22"/>
+              </w:rPr>
+              <w:t xml:space="preserve">Le magicien</w:t>
+            </w:r>
+          </w:p>
+        </w:tc>
+        <w:tc>
+          <w:tcPr>
+            <w:tcW w:type="dxa" w:w="6670"/>
+            <w:tcMar>
+              <w:top w:type="dxa" w:w="160"/>
+              <w:left w:type="dxa" w:w="160"/>
+              <w:bottom w:type="dxa" w:w="160"/>
+              <w:right w:type="dxa" w:w="160"/>
+            </w:tcMar>
+          </w:tcPr>
+          <w:p>
+            <w:r>
+              <w:rPr>
+                <w:i/>
+                <w:iCs/>
+                <w:color w:val="8C8C8C"/>
+                <w:sz w:val="19"/>
+                <w:szCs w:val="19"/>
+              </w:rPr>
+              <w:t xml:space="preserve">À compléter.</w:t>
+            </w:r>
+          </w:p>
+          <w:p>
+            <w:r>
+              <w:t xml:space="preserve"/>
+            </w:r>
+          </w:p>
+          <w:p>
+            <w:r>
+              <w:t xml:space="preserve"/>
+            </w:r>
+          </w:p>
+        </w:tc>
+      </w:tr>
+      <w:tr>
+        <w:tc>
+          <w:tcPr>
+            <w:tcW w:type="dxa" w:w="2400"/>
+            <w:shd w:fill="F2F5FA" w:color="auto" w:val="clear"/>
+            <w:tcMar>
+              <w:top w:type="dxa" w:w="160"/>
+              <w:left w:type="dxa" w:w="160"/>
+              <w:bottom w:type="dxa" w:w="160"/>
+              <w:right w:type="dxa" w:w="120"/>
+            </w:tcMar>
+          </w:tcPr>
+          <w:p>
+            <w:r>
+              <w:rPr>
+                <w:b/>
+                <w:bCs/>
+                <w:color w:val="1F3864"/>
+                <w:sz w:val="22"/>
+                <w:szCs w:val="22"/>
+              </w:rPr>
+              <w:t xml:space="preserve">Le mur</w:t>
+            </w:r>
+          </w:p>
+        </w:tc>
+        <w:tc>
+          <w:tcPr>
+            <w:tcW w:type="dxa" w:w="6670"/>
+            <w:tcMar>
+              <w:top w:type="dxa" w:w="160"/>
+              <w:left w:type="dxa" w:w="160"/>
+              <w:bottom w:type="dxa" w:w="160"/>
+              <w:right w:type="dxa" w:w="160"/>
+            </w:tcMar>
+          </w:tcPr>
+          <w:p>
+            <w:r>
+              <w:rPr>
+                <w:i/>
+                <w:iCs/>
+                <w:color w:val="8C8C8C"/>
+                <w:sz w:val="19"/>
+                <w:szCs w:val="19"/>
+              </w:rPr>
+              <w:t xml:space="preserve">À compléter.</w:t>
+            </w:r>
+          </w:p>
+          <w:p>
+            <w:r>
+              <w:t xml:space="preserve"/>
+            </w:r>
+          </w:p>
+          <w:p>
+            <w:r>
+              <w:t xml:space="preserve"/>
+            </w:r>
+          </w:p>
+        </w:tc>
+      </w:tr>
+      <w:tr>
+        <w:tc>
+          <w:tcPr>
+            <w:tcW w:type="dxa" w:w="2400"/>
+            <w:shd w:fill="F2F5FA" w:color="auto" w:val="clear"/>
+            <w:tcMar>
+              <w:top w:type="dxa" w:w="160"/>
+              <w:left w:type="dxa" w:w="160"/>
+              <w:bottom w:type="dxa" w:w="160"/>
+              <w:right w:type="dxa" w:w="120"/>
+            </w:tcMar>
+          </w:tcPr>
+          <w:p>
+            <w:r>
+              <w:rPr>
+                <w:b/>
+                <w:bCs/>
+                <w:color w:val="1F3864"/>
+                <w:sz w:val="22"/>
+                <w:szCs w:val="22"/>
+              </w:rPr>
+              <w:t xml:space="preserve">Le caméléon</w:t>
+            </w:r>
+          </w:p>
+        </w:tc>
+        <w:tc>
+          <w:tcPr>
+            <w:tcW w:type="dxa" w:w="6670"/>
+            <w:tcMar>
+              <w:top w:type="dxa" w:w="160"/>
+              <w:left w:type="dxa" w:w="160"/>
+              <w:bottom w:type="dxa" w:w="160"/>
+              <w:right w:type="dxa" w:w="160"/>
+            </w:tcMar>
+          </w:tcPr>
+          <w:p>
+            <w:r>
+              <w:rPr>
+                <w:i/>
+                <w:iCs/>
+                <w:color w:val="8C8C8C"/>
+                <w:sz w:val="19"/>
+                <w:szCs w:val="19"/>
+              </w:rPr>
+              <w:t xml:space="preserve">À compléter.</w:t>
+            </w:r>
+          </w:p>
+          <w:p>
+            <w:r>
+              <w:t xml:space="preserve"/>
+            </w:r>
+          </w:p>
+          <w:p>
+            <w:r>
+              <w:t xml:space="preserve"/>
+            </w:r>
+          </w:p>
+        </w:tc>
+      </w:tr>
+    </w:tbl>
+    <w:p>
+      <w:pPr>
+        <w:spacing w:after="160"/>
+      </w:pPr>
+      <w:r>
+        <w:t xml:space="preserve"/>
       </w:r>
     </w:p>
     <w:p>

</xml_diff>

<commit_message>
Le BOA: image du produit final, vise des le premier cours
- Chapeau de la section Tactique reecrit: le BOA est l'image generale du
  joueur que l'on veut obtenir au terme de la formation
- Ajout: le travail commence des le premier cours d'un enfant de trois ans
- Encadre "A retenir" et introduction du document mis a jour
- Sous-titre: Formation du jeune joueur

Co-Authored-By: Claude Opus 5 <noreply@anthropic.com>
Claude-Session: https://claude.ai/code/session_01MsQTwqEjmEDWzu5z6M6Ayx
</commit_message>
<xml_diff>
--- a/Projet_entrainement.docx
+++ b/Projet_entrainement.docx
@@ -29,7 +29,7 @@
           <w:sz w:val="26"/>
           <w:szCs w:val="26"/>
         </w:rPr>
-        <w:t xml:space="preserve">Tactique, technique et conduite des séances</w:t>
+        <w:t xml:space="preserve">Formation du jeune joueur — tactique, technique et conduite des séances</w:t>
       </w:r>
     </w:p>
     <w:p>
@@ -107,7 +107,7 @@
         <w:t xml:space="preserve">la gestion mentale</w:t>
       </w:r>
       <w:r>
-        <w:t xml:space="preserve">. Il constitue une base de départ, destinée à être complétée et ajustée au fil des séances.</w:t>
+        <w:t xml:space="preserve">. Il part du « produit » final visé — le joueur que l’on veut obtenir au terme de la formation — et remonte vers les contenus de séance. Il constitue une base de départ, destinée à être complétée et ajustée au fil des séances.</w:t>
       </w:r>
     </w:p>
     <w:p>
@@ -135,7 +135,7 @@
         <w:jc w:val="both"/>
       </w:pPr>
       <w:r>
-        <w:t xml:space="preserve">L’image du produit final que l’on veut atteindre est le </w:t>
+        <w:t xml:space="preserve">Le </w:t>
       </w:r>
       <w:r>
         <w:rPr>
@@ -145,7 +145,103 @@
         <w:t xml:space="preserve">BOA</w:t>
       </w:r>
       <w:r>
-        <w:t xml:space="preserve">. C’est la référence vers laquelle tend l’ensemble du travail : tout ce qui suit sert à y conduire.</w:t>
+        <w:t xml:space="preserve"> est l’</w:t>
+      </w:r>
+      <w:r>
+        <w:rPr>
+          <w:b/>
+          <w:bCs/>
+        </w:rPr>
+        <w:t xml:space="preserve">image générale de ce que l’on veut obtenir de l’enfant au bout de sa formation</w:t>
+      </w:r>
+      <w:r>
+        <w:t xml:space="preserve">. Autrement dit : de celui qui commence à jouer au tennis aujourd’hui, quel joueur souhaite-t-on voir sortir à l’issue du parcours ? Le BOA répond à cette question — il décrit le « produit » final visé.</w:t>
+      </w:r>
+    </w:p>
+    <w:p>
+      <w:pPr>
+        <w:spacing w:after="120" w:before="60" w:line="276"/>
+        <w:jc w:val="both"/>
+      </w:pPr>
+      <w:r>
+        <w:t xml:space="preserve">C’est la référence vers laquelle tend l’ensemble du travail. Tout ce qui suit — tactique comme technique — ne se justifie que par rapport à cette image d’arrivée : chaque contenu de séance doit pouvoir s’y rattacher.</w:t>
+      </w:r>
+    </w:p>
+    <w:p>
+      <w:pPr>
+        <w:spacing w:after="120" w:before="60" w:line="276"/>
+        <w:jc w:val="both"/>
+      </w:pPr>
+      <w:r>
+        <w:t xml:space="preserve">Ce travail commence immédiatement : </w:t>
+      </w:r>
+      <w:r>
+        <w:rPr>
+          <w:b/>
+          <w:bCs/>
+        </w:rPr>
+        <w:t xml:space="preserve">dès le tout premier cours d’un enfant de trois ans, on bosse déjà pour en faire un bon BOA</w:t>
+      </w:r>
+      <w:r>
+        <w:t xml:space="preserve">. Il n’y a pas un âge où l’on ferait « autre chose » avant d’entrer dans la démarche, puis un âge où l’on s’y mettrait vraiment. La mini-compétition du plus jeune et le match du joueur formé relèvent de la même intention, avec des moyens adaptés à chaque âge.</w:t>
+      </w:r>
+    </w:p>
+    <w:tbl>
+      <w:tblPr>
+        <w:tblW w:type="dxa" w:w="9070"/>
+        <w:tblBorders>
+          <w:top w:val="single" w:color="C9D3E6" w:sz="2"/>
+          <w:left w:val="single" w:color="1F3864" w:sz="18"/>
+          <w:bottom w:val="single" w:color="C9D3E6" w:sz="2"/>
+          <w:right w:val="single" w:color="C9D3E6" w:sz="2"/>
+          <w:insideH w:val="none" w:color="FFFFFF" w:sz="0"/>
+          <w:insideV w:val="none" w:color="FFFFFF" w:sz="0"/>
+        </w:tblBorders>
+      </w:tblPr>
+      <w:tblGrid>
+        <w:gridCol w:w="9070"/>
+      </w:tblGrid>
+      <w:tr>
+        <w:tc>
+          <w:tcPr>
+            <w:tcW w:type="dxa" w:w="9070"/>
+            <w:shd w:fill="F2F5FA" w:color="auto" w:val="clear"/>
+            <w:tcMar>
+              <w:top w:type="dxa" w:w="140"/>
+              <w:left w:type="dxa" w:w="180"/>
+              <w:bottom w:type="dxa" w:w="140"/>
+              <w:right w:type="dxa" w:w="180"/>
+            </w:tcMar>
+          </w:tcPr>
+          <w:p>
+            <w:r>
+              <w:rPr>
+                <w:b/>
+                <w:bCs/>
+                <w:color w:val="1F3864"/>
+                <w:sz w:val="20"/>
+                <w:szCs w:val="20"/>
+              </w:rPr>
+              <w:t xml:space="preserve">À retenir : </w:t>
+            </w:r>
+            <w:r>
+              <w:rPr>
+                <w:color w:val="262626"/>
+                <w:sz w:val="20"/>
+                <w:szCs w:val="20"/>
+              </w:rPr>
+              <w:t xml:space="preserve">le BOA n’est pas un exercice ni une consigne de match. C’est l’image générale du joueur que l’on veut obtenir au terme de la formation — le « produit » final.</w:t>
+            </w:r>
+          </w:p>
+        </w:tc>
+      </w:tr>
+    </w:tbl>
+    <w:p>
+      <w:pPr>
+        <w:spacing w:after="160"/>
+      </w:pPr>
+      <w:r>
+        <w:t xml:space="preserve"/>
       </w:r>
     </w:p>
     <w:p>

</xml_diff>

<commit_message>
Nouvelle section 2.2 "Des les premiers jeux"
Tous les jeux et exercices proposes des le plus jeune age doivent etre
techniquement corrects: appuis des les premieres manipulations, bonnes
prises des le jeu en 2D. Sous-sections suivantes renumerotees.

Co-Authored-By: Claude Opus 5 <noreply@anthropic.com>
Claude-Session: https://claude.ai/code/session_01MsQTwqEjmEDWzu5z6M6Ayx
</commit_message>
<xml_diff>
--- a/Projet_entrainement.docx
+++ b/Projet_entrainement.docx
@@ -1002,47 +1002,95 @@
           <w:sz w:val="24"/>
           <w:szCs w:val="24"/>
         </w:rPr>
-        <w:t xml:space="preserve">2.2 Éléments fondamentaux et apprentissage</w:t>
-      </w:r>
-    </w:p>
-    <w:p>
-      <w:pPr>
-        <w:pStyle w:val="ListParagraph"/>
-        <w:numPr>
-          <w:ilvl w:val="0"/>
-          <w:numId w:val="2"/>
-        </w:numPr>
-        <w:spacing w:after="50" w:before="50" w:line="264"/>
-      </w:pPr>
-      <w:r>
-        <w:rPr>
-          <w:b/>
-          <w:bCs/>
-        </w:rPr>
-        <w:t xml:space="preserve">Éléments fondamentaux</w:t>
-      </w:r>
-      <w:r>
-        <w:t xml:space="preserve"> : identifier le socle non négociable, commun à tous, sur lequel s’appuie toute la construction technique.</w:t>
-      </w:r>
-    </w:p>
-    <w:p>
-      <w:pPr>
-        <w:pStyle w:val="ListParagraph"/>
-        <w:numPr>
-          <w:ilvl w:val="0"/>
-          <w:numId w:val="2"/>
-        </w:numPr>
-        <w:spacing w:after="50" w:before="50" w:line="264"/>
-      </w:pPr>
-      <w:r>
-        <w:rPr>
-          <w:b/>
-          <w:bCs/>
-        </w:rPr>
-        <w:t xml:space="preserve">Distinction haut niveau / apprentissage</w:t>
-      </w:r>
-      <w:r>
-        <w:t xml:space="preserve"> : ce qui s’observe chez les meilleurs n’est pas directement transposable à l’apprentissage. Il faut distinguer le modèle de référence de la marche à suivre pour y parvenir.</w:t>
+        <w:t xml:space="preserve">2.2 Dès les premiers jeux</w:t>
+      </w:r>
+    </w:p>
+    <w:p>
+      <w:pPr>
+        <w:spacing w:after="120" w:before="60" w:line="276"/>
+        <w:jc w:val="both"/>
+      </w:pPr>
+      <w:r>
+        <w:t xml:space="preserve">Le BOA visé commande immédiatement le contenu technique. </w:t>
+      </w:r>
+      <w:r>
+        <w:rPr>
+          <w:b/>
+          <w:bCs/>
+        </w:rPr>
+        <w:t xml:space="preserve">Tous les jeux et exercices proposés dès le plus jeune âge doivent être techniquement corrects</w:t>
+      </w:r>
+      <w:r>
+        <w:t xml:space="preserve"> : on n’attend pas que l’enfant grandisse pour s’occuper de la forme. Ce qui est installé de travers au départ devra être défait plus tard — autant construire juste tout de suite.</w:t>
+      </w:r>
+    </w:p>
+    <w:p>
+      <w:pPr>
+        <w:pStyle w:val="ListParagraph"/>
+        <w:numPr>
+          <w:ilvl w:val="0"/>
+          <w:numId w:val="2"/>
+        </w:numPr>
+        <w:spacing w:after="50" w:before="50" w:line="264"/>
+      </w:pPr>
+      <w:r>
+        <w:rPr>
+          <w:b/>
+          <w:bCs/>
+        </w:rPr>
+        <w:t xml:space="preserve">Les appuis</w:t>
+      </w:r>
+      <w:r>
+        <w:t xml:space="preserve"> s’apprennent dès les </w:t>
+      </w:r>
+      <w:r>
+        <w:rPr>
+          <w:b/>
+          <w:bCs/>
+        </w:rPr>
+        <w:t xml:space="preserve">premières manipulations</w:t>
+      </w:r>
+      <w:r>
+        <w:t xml:space="preserve"> : orientation, équilibre, déplacement vers la balle.</w:t>
+      </w:r>
+    </w:p>
+    <w:p>
+      <w:pPr>
+        <w:pStyle w:val="ListParagraph"/>
+        <w:numPr>
+          <w:ilvl w:val="0"/>
+          <w:numId w:val="2"/>
+        </w:numPr>
+        <w:spacing w:after="50" w:before="50" w:line="264"/>
+      </w:pPr>
+      <w:r>
+        <w:rPr>
+          <w:b/>
+          <w:bCs/>
+        </w:rPr>
+        <w:t xml:space="preserve">Les bonnes prises</w:t>
+      </w:r>
+      <w:r>
+        <w:t xml:space="preserve"> sont mises en place d’emblée, </w:t>
+      </w:r>
+      <w:r>
+        <w:rPr>
+          <w:b/>
+          <w:bCs/>
+        </w:rPr>
+        <w:t xml:space="preserve">dès le jeu en 2D</w:t>
+      </w:r>
+      <w:r>
+        <w:t xml:space="preserve">.</w:t>
+      </w:r>
+    </w:p>
+    <w:p>
+      <w:pPr>
+        <w:spacing w:after="120" w:before="60" w:line="276"/>
+        <w:jc w:val="both"/>
+      </w:pPr>
+      <w:r>
+        <w:t xml:space="preserve">Le jeu reste le support — l’enfant joue — mais chaque jeu est choisi pour ce qu’il construit techniquement.</w:t>
       </w:r>
     </w:p>
     <w:p>
@@ -1058,7 +1106,63 @@
           <w:sz w:val="24"/>
           <w:szCs w:val="24"/>
         </w:rPr>
-        <w:t xml:space="preserve">2.3 Respecter les lois biomécaniques</w:t>
+        <w:t xml:space="preserve">2.3 Éléments fondamentaux et apprentissage</w:t>
+      </w:r>
+    </w:p>
+    <w:p>
+      <w:pPr>
+        <w:pStyle w:val="ListParagraph"/>
+        <w:numPr>
+          <w:ilvl w:val="0"/>
+          <w:numId w:val="2"/>
+        </w:numPr>
+        <w:spacing w:after="50" w:before="50" w:line="264"/>
+      </w:pPr>
+      <w:r>
+        <w:rPr>
+          <w:b/>
+          <w:bCs/>
+        </w:rPr>
+        <w:t xml:space="preserve">Éléments fondamentaux</w:t>
+      </w:r>
+      <w:r>
+        <w:t xml:space="preserve"> : identifier le socle non négociable, commun à tous, sur lequel s’appuie toute la construction technique.</w:t>
+      </w:r>
+    </w:p>
+    <w:p>
+      <w:pPr>
+        <w:pStyle w:val="ListParagraph"/>
+        <w:numPr>
+          <w:ilvl w:val="0"/>
+          <w:numId w:val="2"/>
+        </w:numPr>
+        <w:spacing w:after="50" w:before="50" w:line="264"/>
+      </w:pPr>
+      <w:r>
+        <w:rPr>
+          <w:b/>
+          <w:bCs/>
+        </w:rPr>
+        <w:t xml:space="preserve">Distinction haut niveau / apprentissage</w:t>
+      </w:r>
+      <w:r>
+        <w:t xml:space="preserve"> : ce qui s’observe chez les meilleurs n’est pas directement transposable à l’apprentissage. Il faut distinguer le modèle de référence de la marche à suivre pour y parvenir.</w:t>
+      </w:r>
+    </w:p>
+    <w:p>
+      <w:pPr>
+        <w:pStyle w:val="Heading2"/>
+        <w:spacing w:after="80" w:before="240"/>
+      </w:pPr>
+      <w:r>
+        <w:rPr>
+          <w:b/>
+          <w:bCs/>
+          <w:color w:val="1F3864"/>
+          <w:sz w:val="24"/>
+          <w:szCs w:val="24"/>
+        </w:rPr>
+        <w:t xml:space="preserve">2.4 Respecter les lois biomécaniques</w:t>
       </w:r>
     </w:p>
     <w:p>
@@ -1204,7 +1308,7 @@
           <w:sz w:val="24"/>
           <w:szCs w:val="24"/>
         </w:rPr>
-        <w:t xml:space="preserve">2.4 Méthodes et outils</w:t>
+        <w:t xml:space="preserve">2.5 Méthodes et outils</w:t>
       </w:r>
     </w:p>
     <w:p>

</xml_diff>

<commit_message>
Nouvelle section 2.3: des objectifs qui evoluent avec l'enfant
Les objectifs evoluent avec l'enfant; proprete technique exigee a 14 ans
au maximum, au-dela les changements deviennent cognitivement plus
difficiles. Sous-sections suivantes renumerotees.

Co-Authored-By: Claude Opus 5 <noreply@anthropic.com>
Claude-Session: https://claude.ai/code/session_01MsQTwqEjmEDWzu5z6M6Ayx
</commit_message>
<xml_diff>
--- a/Projet_entrainement.docx
+++ b/Projet_entrainement.docx
@@ -1106,63 +1106,7 @@
           <w:sz w:val="24"/>
           <w:szCs w:val="24"/>
         </w:rPr>
-        <w:t xml:space="preserve">2.3 Éléments fondamentaux et apprentissage</w:t>
-      </w:r>
-    </w:p>
-    <w:p>
-      <w:pPr>
-        <w:pStyle w:val="ListParagraph"/>
-        <w:numPr>
-          <w:ilvl w:val="0"/>
-          <w:numId w:val="2"/>
-        </w:numPr>
-        <w:spacing w:after="50" w:before="50" w:line="264"/>
-      </w:pPr>
-      <w:r>
-        <w:rPr>
-          <w:b/>
-          <w:bCs/>
-        </w:rPr>
-        <w:t xml:space="preserve">Éléments fondamentaux</w:t>
-      </w:r>
-      <w:r>
-        <w:t xml:space="preserve"> : identifier le socle non négociable, commun à tous, sur lequel s’appuie toute la construction technique.</w:t>
-      </w:r>
-    </w:p>
-    <w:p>
-      <w:pPr>
-        <w:pStyle w:val="ListParagraph"/>
-        <w:numPr>
-          <w:ilvl w:val="0"/>
-          <w:numId w:val="2"/>
-        </w:numPr>
-        <w:spacing w:after="50" w:before="50" w:line="264"/>
-      </w:pPr>
-      <w:r>
-        <w:rPr>
-          <w:b/>
-          <w:bCs/>
-        </w:rPr>
-        <w:t xml:space="preserve">Distinction haut niveau / apprentissage</w:t>
-      </w:r>
-      <w:r>
-        <w:t xml:space="preserve"> : ce qui s’observe chez les meilleurs n’est pas directement transposable à l’apprentissage. Il faut distinguer le modèle de référence de la marche à suivre pour y parvenir.</w:t>
-      </w:r>
-    </w:p>
-    <w:p>
-      <w:pPr>
-        <w:pStyle w:val="Heading2"/>
-        <w:spacing w:after="80" w:before="240"/>
-      </w:pPr>
-      <w:r>
-        <w:rPr>
-          <w:b/>
-          <w:bCs/>
-          <w:color w:val="1F3864"/>
-          <w:sz w:val="24"/>
-          <w:szCs w:val="24"/>
-        </w:rPr>
-        <w:t xml:space="preserve">2.4 Respecter les lois biomécaniques</w:t>
+        <w:t xml:space="preserve">2.3 Des objectifs qui évoluent avec l’enfant</w:t>
       </w:r>
     </w:p>
     <w:p>
@@ -1171,70 +1115,46 @@
         <w:jc w:val="both"/>
       </w:pPr>
       <w:r>
-        <w:t xml:space="preserve">Quelle que soit la forme gestuelle retenue, elle doit respecter les principes mécaniques qui conditionnent la performance :</w:t>
-      </w:r>
-    </w:p>
-    <w:p>
-      <w:pPr>
-        <w:pStyle w:val="ListParagraph"/>
-        <w:numPr>
-          <w:ilvl w:val="0"/>
-          <w:numId w:val="2"/>
-        </w:numPr>
-        <w:spacing w:after="50" w:before="50" w:line="264"/>
-      </w:pPr>
-      <w:r>
-        <w:rPr>
-          <w:b/>
-          <w:bCs/>
-        </w:rPr>
-        <w:t xml:space="preserve">Deux impulsions successives</w:t>
-      </w:r>
-      <w:r>
-        <w:t xml:space="preserve">, enchaînées sans rupture.</w:t>
-      </w:r>
-    </w:p>
-    <w:p>
-      <w:pPr>
-        <w:pStyle w:val="ListParagraph"/>
-        <w:numPr>
-          <w:ilvl w:val="0"/>
-          <w:numId w:val="2"/>
-        </w:numPr>
-        <w:spacing w:after="50" w:before="50" w:line="264"/>
-      </w:pPr>
-      <w:r>
-        <w:rPr>
-          <w:b/>
-          <w:bCs/>
-        </w:rPr>
-        <w:t xml:space="preserve">Générer de l’énergie</w:t>
-      </w:r>
-      <w:r>
-        <w:t xml:space="preserve"> et la transmettre, plutôt que la dissiper.</w:t>
-      </w:r>
-    </w:p>
-    <w:p>
-      <w:pPr>
-        <w:pStyle w:val="ListParagraph"/>
-        <w:numPr>
-          <w:ilvl w:val="0"/>
-          <w:numId w:val="2"/>
-        </w:numPr>
-        <w:spacing w:after="50" w:before="50" w:line="264"/>
-      </w:pPr>
-      <w:r>
-        <w:t xml:space="preserve">Travailler les </w:t>
-      </w:r>
-      <w:r>
-        <w:rPr>
-          <w:b/>
-          <w:bCs/>
-        </w:rPr>
-        <w:t xml:space="preserve">appuis, les transferts et la suspension</w:t>
-      </w:r>
-      <w:r>
-        <w:t xml:space="preserve">, qui conditionnent la qualité de la mise en action.</w:t>
+        <w:t xml:space="preserve">Lorsque l’enfant évolue, </w:t>
+      </w:r>
+      <w:r>
+        <w:rPr>
+          <w:b/>
+          <w:bCs/>
+        </w:rPr>
+        <w:t xml:space="preserve">les objectifs évoluent avec lui</w:t>
+      </w:r>
+      <w:r>
+        <w:t xml:space="preserve">. Ce que l’on exige à six ans, à dix ans et à treize ans n’est pas de même nature : l’exigence se déplace à mesure que l’enfant grandit, chaque étape préparant la suivante.</w:t>
+      </w:r>
+    </w:p>
+    <w:p>
+      <w:pPr>
+        <w:spacing w:after="120" w:before="60" w:line="276"/>
+        <w:jc w:val="both"/>
+      </w:pPr>
+      <w:r>
+        <w:t xml:space="preserve">L’échéance, elle, est claire : </w:t>
+      </w:r>
+      <w:r>
+        <w:rPr>
+          <w:b/>
+          <w:bCs/>
+        </w:rPr>
+        <w:t xml:space="preserve">l’enfant doit être propre techniquement à 14 ans au maximum</w:t>
+      </w:r>
+      <w:r>
+        <w:t xml:space="preserve">. Au-delà, les changements deviennent </w:t>
+      </w:r>
+      <w:r>
+        <w:rPr>
+          <w:b/>
+          <w:bCs/>
+        </w:rPr>
+        <w:t xml:space="preserve">cognitivement plus difficiles</w:t>
+      </w:r>
+      <w:r>
+        <w:t xml:space="preserve"> : le geste est automatisé, et le défaire coûte bien plus cher qu’il n’aurait coûté de le construire juste. C’est ce qui justifie l’exigence technique dès les premiers jeux.</w:t>
       </w:r>
     </w:p>
     <w:tbl>
@@ -1273,6 +1193,208 @@
                 <w:sz w:val="20"/>
                 <w:szCs w:val="20"/>
               </w:rPr>
+              <w:t xml:space="preserve">Échéance : </w:t>
+            </w:r>
+            <w:r>
+              <w:rPr>
+                <w:color w:val="262626"/>
+                <w:sz w:val="20"/>
+                <w:szCs w:val="20"/>
+              </w:rPr>
+              <w:t xml:space="preserve">propreté technique acquise à 14 ans au plus tard — au-delà, on corrige beaucoup plus difficilement.</w:t>
+            </w:r>
+          </w:p>
+        </w:tc>
+      </w:tr>
+    </w:tbl>
+    <w:p>
+      <w:pPr>
+        <w:spacing w:after="160"/>
+      </w:pPr>
+      <w:r>
+        <w:t xml:space="preserve"/>
+      </w:r>
+    </w:p>
+    <w:p>
+      <w:pPr>
+        <w:pStyle w:val="Heading2"/>
+        <w:spacing w:after="80" w:before="240"/>
+      </w:pPr>
+      <w:r>
+        <w:rPr>
+          <w:b/>
+          <w:bCs/>
+          <w:color w:val="1F3864"/>
+          <w:sz w:val="24"/>
+          <w:szCs w:val="24"/>
+        </w:rPr>
+        <w:t xml:space="preserve">2.4 Éléments fondamentaux et apprentissage</w:t>
+      </w:r>
+    </w:p>
+    <w:p>
+      <w:pPr>
+        <w:pStyle w:val="ListParagraph"/>
+        <w:numPr>
+          <w:ilvl w:val="0"/>
+          <w:numId w:val="2"/>
+        </w:numPr>
+        <w:spacing w:after="50" w:before="50" w:line="264"/>
+      </w:pPr>
+      <w:r>
+        <w:rPr>
+          <w:b/>
+          <w:bCs/>
+        </w:rPr>
+        <w:t xml:space="preserve">Éléments fondamentaux</w:t>
+      </w:r>
+      <w:r>
+        <w:t xml:space="preserve"> : identifier le socle non négociable, commun à tous, sur lequel s’appuie toute la construction technique.</w:t>
+      </w:r>
+    </w:p>
+    <w:p>
+      <w:pPr>
+        <w:pStyle w:val="ListParagraph"/>
+        <w:numPr>
+          <w:ilvl w:val="0"/>
+          <w:numId w:val="2"/>
+        </w:numPr>
+        <w:spacing w:after="50" w:before="50" w:line="264"/>
+      </w:pPr>
+      <w:r>
+        <w:rPr>
+          <w:b/>
+          <w:bCs/>
+        </w:rPr>
+        <w:t xml:space="preserve">Distinction haut niveau / apprentissage</w:t>
+      </w:r>
+      <w:r>
+        <w:t xml:space="preserve"> : ce qui s’observe chez les meilleurs n’est pas directement transposable à l’apprentissage. Il faut distinguer le modèle de référence de la marche à suivre pour y parvenir.</w:t>
+      </w:r>
+    </w:p>
+    <w:p>
+      <w:pPr>
+        <w:pStyle w:val="Heading2"/>
+        <w:spacing w:after="80" w:before="240"/>
+      </w:pPr>
+      <w:r>
+        <w:rPr>
+          <w:b/>
+          <w:bCs/>
+          <w:color w:val="1F3864"/>
+          <w:sz w:val="24"/>
+          <w:szCs w:val="24"/>
+        </w:rPr>
+        <w:t xml:space="preserve">2.5 Respecter les lois biomécaniques</w:t>
+      </w:r>
+    </w:p>
+    <w:p>
+      <w:pPr>
+        <w:spacing w:after="120" w:before="60" w:line="276"/>
+        <w:jc w:val="both"/>
+      </w:pPr>
+      <w:r>
+        <w:t xml:space="preserve">Quelle que soit la forme gestuelle retenue, elle doit respecter les principes mécaniques qui conditionnent la performance :</w:t>
+      </w:r>
+    </w:p>
+    <w:p>
+      <w:pPr>
+        <w:pStyle w:val="ListParagraph"/>
+        <w:numPr>
+          <w:ilvl w:val="0"/>
+          <w:numId w:val="2"/>
+        </w:numPr>
+        <w:spacing w:after="50" w:before="50" w:line="264"/>
+      </w:pPr>
+      <w:r>
+        <w:rPr>
+          <w:b/>
+          <w:bCs/>
+        </w:rPr>
+        <w:t xml:space="preserve">Deux impulsions successives</w:t>
+      </w:r>
+      <w:r>
+        <w:t xml:space="preserve">, enchaînées sans rupture.</w:t>
+      </w:r>
+    </w:p>
+    <w:p>
+      <w:pPr>
+        <w:pStyle w:val="ListParagraph"/>
+        <w:numPr>
+          <w:ilvl w:val="0"/>
+          <w:numId w:val="2"/>
+        </w:numPr>
+        <w:spacing w:after="50" w:before="50" w:line="264"/>
+      </w:pPr>
+      <w:r>
+        <w:rPr>
+          <w:b/>
+          <w:bCs/>
+        </w:rPr>
+        <w:t xml:space="preserve">Générer de l’énergie</w:t>
+      </w:r>
+      <w:r>
+        <w:t xml:space="preserve"> et la transmettre, plutôt que la dissiper.</w:t>
+      </w:r>
+    </w:p>
+    <w:p>
+      <w:pPr>
+        <w:pStyle w:val="ListParagraph"/>
+        <w:numPr>
+          <w:ilvl w:val="0"/>
+          <w:numId w:val="2"/>
+        </w:numPr>
+        <w:spacing w:after="50" w:before="50" w:line="264"/>
+      </w:pPr>
+      <w:r>
+        <w:t xml:space="preserve">Travailler les </w:t>
+      </w:r>
+      <w:r>
+        <w:rPr>
+          <w:b/>
+          <w:bCs/>
+        </w:rPr>
+        <w:t xml:space="preserve">appuis, les transferts et la suspension</w:t>
+      </w:r>
+      <w:r>
+        <w:t xml:space="preserve">, qui conditionnent la qualité de la mise en action.</w:t>
+      </w:r>
+    </w:p>
+    <w:tbl>
+      <w:tblPr>
+        <w:tblW w:type="dxa" w:w="9070"/>
+        <w:tblBorders>
+          <w:top w:val="single" w:color="C9D3E6" w:sz="2"/>
+          <w:left w:val="single" w:color="1F3864" w:sz="18"/>
+          <w:bottom w:val="single" w:color="C9D3E6" w:sz="2"/>
+          <w:right w:val="single" w:color="C9D3E6" w:sz="2"/>
+          <w:insideH w:val="none" w:color="FFFFFF" w:sz="0"/>
+          <w:insideV w:val="none" w:color="FFFFFF" w:sz="0"/>
+        </w:tblBorders>
+      </w:tblPr>
+      <w:tblGrid>
+        <w:gridCol w:w="9070"/>
+      </w:tblGrid>
+      <w:tr>
+        <w:tc>
+          <w:tcPr>
+            <w:tcW w:type="dxa" w:w="9070"/>
+            <w:shd w:fill="F2F5FA" w:color="auto" w:val="clear"/>
+            <w:tcMar>
+              <w:top w:type="dxa" w:w="140"/>
+              <w:left w:type="dxa" w:w="180"/>
+              <w:bottom w:type="dxa" w:w="140"/>
+              <w:right w:type="dxa" w:w="180"/>
+            </w:tcMar>
+          </w:tcPr>
+          <w:p>
+            <w:r>
+              <w:rPr>
+                <w:b/>
+                <w:bCs/>
+                <w:color w:val="1F3864"/>
+                <w:sz w:val="20"/>
+                <w:szCs w:val="20"/>
+              </w:rPr>
               <w:t xml:space="preserve">Critère de réussite : </w:t>
             </w:r>
             <w:r>
@@ -1308,7 +1430,7 @@
           <w:sz w:val="24"/>
           <w:szCs w:val="24"/>
         </w:rPr>
-        <w:t xml:space="preserve">2.5 Méthodes et outils</w:t>
+        <w:t xml:space="preserve">2.6 Méthodes et outils</w:t>
       </w:r>
     </w:p>
     <w:p>

</xml_diff>

<commit_message>
Nouvelle section 2.4: un nettoyage permanent
La technique se nettoie tout au long du cursus: en tournoi elle peut
changer sous la pression. Meme le numero 1 mondial retravaille sa
technique. Sous-sections suivantes renumerotees.

Co-Authored-By: Claude Opus 5 <noreply@anthropic.com>
Claude-Session: https://claude.ai/code/session_01MsQTwqEjmEDWzu5z6M6Ayx
</commit_message>
<xml_diff>
--- a/Projet_entrainement.docx
+++ b/Projet_entrainement.docx
@@ -1228,47 +1228,55 @@
           <w:sz w:val="24"/>
           <w:szCs w:val="24"/>
         </w:rPr>
-        <w:t xml:space="preserve">2.4 Éléments fondamentaux et apprentissage</w:t>
-      </w:r>
-    </w:p>
-    <w:p>
-      <w:pPr>
-        <w:pStyle w:val="ListParagraph"/>
-        <w:numPr>
-          <w:ilvl w:val="0"/>
-          <w:numId w:val="2"/>
-        </w:numPr>
-        <w:spacing w:after="50" w:before="50" w:line="264"/>
-      </w:pPr>
-      <w:r>
-        <w:rPr>
-          <w:b/>
-          <w:bCs/>
-        </w:rPr>
-        <w:t xml:space="preserve">Éléments fondamentaux</w:t>
-      </w:r>
-      <w:r>
-        <w:t xml:space="preserve"> : identifier le socle non négociable, commun à tous, sur lequel s’appuie toute la construction technique.</w:t>
-      </w:r>
-    </w:p>
-    <w:p>
-      <w:pPr>
-        <w:pStyle w:val="ListParagraph"/>
-        <w:numPr>
-          <w:ilvl w:val="0"/>
-          <w:numId w:val="2"/>
-        </w:numPr>
-        <w:spacing w:after="50" w:before="50" w:line="264"/>
-      </w:pPr>
-      <w:r>
-        <w:rPr>
-          <w:b/>
-          <w:bCs/>
-        </w:rPr>
-        <w:t xml:space="preserve">Distinction haut niveau / apprentissage</w:t>
-      </w:r>
-      <w:r>
-        <w:t xml:space="preserve"> : ce qui s’observe chez les meilleurs n’est pas directement transposable à l’apprentissage. Il faut distinguer le modèle de référence de la marche à suivre pour y parvenir.</w:t>
+        <w:t xml:space="preserve">2.4 Un nettoyage permanent</w:t>
+      </w:r>
+    </w:p>
+    <w:p>
+      <w:pPr>
+        <w:spacing w:after="120" w:before="60" w:line="276"/>
+        <w:jc w:val="both"/>
+      </w:pPr>
+      <w:r>
+        <w:t xml:space="preserve">L’échéance des 14 ans ne signifie pas que le travail technique s’arrête. </w:t>
+      </w:r>
+      <w:r>
+        <w:rPr>
+          <w:b/>
+          <w:bCs/>
+        </w:rPr>
+        <w:t xml:space="preserve">Tout au long du cursus, il faudra nettoyer la technique</w:t>
+      </w:r>
+      <w:r>
+        <w:t xml:space="preserve">. En tournoi en particulier, sous la pression du résultat et de l’adversaire, </w:t>
+      </w:r>
+      <w:r>
+        <w:rPr>
+          <w:b/>
+          <w:bCs/>
+        </w:rPr>
+        <w:t xml:space="preserve">la technique peut changer</w:t>
+      </w:r>
+      <w:r>
+        <w:t xml:space="preserve"> : le joueur prend des raccourcis, se replie sur ce qui fonctionne à l’instant, et des défauts s’installent sans qu’il s’en aperçoive.</w:t>
+      </w:r>
+    </w:p>
+    <w:p>
+      <w:pPr>
+        <w:spacing w:after="120" w:before="60" w:line="276"/>
+        <w:jc w:val="both"/>
+      </w:pPr>
+      <w:r>
+        <w:t xml:space="preserve">Ce n’est pas un signe d’échec, c’est le fonctionnement normal du jeu en compétition. </w:t>
+      </w:r>
+      <w:r>
+        <w:rPr>
+          <w:b/>
+          <w:bCs/>
+        </w:rPr>
+        <w:t xml:space="preserve">Même le numéro 1 mondial retravaille sa technique</w:t>
+      </w:r>
+      <w:r>
+        <w:t xml:space="preserve">. Le retour régulier sur les fondamentaux fait donc partie du cursus à toutes les étapes, au même titre que le travail tactique — et non d’une phase que l’on refermerait une fois pour toutes.</w:t>
       </w:r>
     </w:p>
     <w:p>
@@ -1284,7 +1292,63 @@
           <w:sz w:val="24"/>
           <w:szCs w:val="24"/>
         </w:rPr>
-        <w:t xml:space="preserve">2.5 Respecter les lois biomécaniques</w:t>
+        <w:t xml:space="preserve">2.5 Éléments fondamentaux et apprentissage</w:t>
+      </w:r>
+    </w:p>
+    <w:p>
+      <w:pPr>
+        <w:pStyle w:val="ListParagraph"/>
+        <w:numPr>
+          <w:ilvl w:val="0"/>
+          <w:numId w:val="2"/>
+        </w:numPr>
+        <w:spacing w:after="50" w:before="50" w:line="264"/>
+      </w:pPr>
+      <w:r>
+        <w:rPr>
+          <w:b/>
+          <w:bCs/>
+        </w:rPr>
+        <w:t xml:space="preserve">Éléments fondamentaux</w:t>
+      </w:r>
+      <w:r>
+        <w:t xml:space="preserve"> : identifier le socle non négociable, commun à tous, sur lequel s’appuie toute la construction technique.</w:t>
+      </w:r>
+    </w:p>
+    <w:p>
+      <w:pPr>
+        <w:pStyle w:val="ListParagraph"/>
+        <w:numPr>
+          <w:ilvl w:val="0"/>
+          <w:numId w:val="2"/>
+        </w:numPr>
+        <w:spacing w:after="50" w:before="50" w:line="264"/>
+      </w:pPr>
+      <w:r>
+        <w:rPr>
+          <w:b/>
+          <w:bCs/>
+        </w:rPr>
+        <w:t xml:space="preserve">Distinction haut niveau / apprentissage</w:t>
+      </w:r>
+      <w:r>
+        <w:t xml:space="preserve"> : ce qui s’observe chez les meilleurs n’est pas directement transposable à l’apprentissage. Il faut distinguer le modèle de référence de la marche à suivre pour y parvenir.</w:t>
+      </w:r>
+    </w:p>
+    <w:p>
+      <w:pPr>
+        <w:pStyle w:val="Heading2"/>
+        <w:spacing w:after="80" w:before="240"/>
+      </w:pPr>
+      <w:r>
+        <w:rPr>
+          <w:b/>
+          <w:bCs/>
+          <w:color w:val="1F3864"/>
+          <w:sz w:val="24"/>
+          <w:szCs w:val="24"/>
+        </w:rPr>
+        <w:t xml:space="preserve">2.6 Respecter les lois biomécaniques</w:t>
       </w:r>
     </w:p>
     <w:p>
@@ -1430,7 +1494,7 @@
           <w:sz w:val="24"/>
           <w:szCs w:val="24"/>
         </w:rPr>
-        <w:t xml:space="preserve">2.6 Méthodes et outils</w:t>
+        <w:t xml:space="preserve">2.7 Méthodes et outils</w:t>
       </w:r>
     </w:p>
     <w:p>

</xml_diff>

<commit_message>
Section 3 reecrite: evolution de l'apprentissage du BOA
- Prealable: volume avec intensite avant d'aborder les enchainements
- Accordeon: ne plus attendre la balle, faire un pas vers elle; ameliore le
  transfert du poids du corps et enleve du temps a l'adversaire
- Objectif: en faire un automatisme
- Sans perdre la solidite acquise avant

Co-Authored-By: Claude Opus 5 <noreply@anthropic.com>
Claude-Session: https://claude.ai/code/session_01MsQTwqEjmEDWzu5z6M6Ayx
</commit_message>
<xml_diff>
--- a/Projet_entrainement.docx
+++ b/Projet_entrainement.docx
@@ -84,7 +84,7 @@
           <w:b/>
           <w:bCs/>
         </w:rPr>
-        <w:t xml:space="preserve">l’évolution du travail</w:t>
+        <w:t xml:space="preserve">l’évolution de l’apprentissage du BOA</w:t>
       </w:r>
       <w:r>
         <w:t xml:space="preserve">, </w:t>
@@ -1661,7 +1661,7 @@
           <w:sz w:val="30"/>
           <w:szCs w:val="30"/>
         </w:rPr>
-        <w:t xml:space="preserve">3. Évolution du travail</w:t>
+        <w:t xml:space="preserve">3. Évolution de l’apprentissage du BOA</w:t>
       </w:r>
     </w:p>
     <w:p>
@@ -1670,7 +1670,96 @@
         <w:jc w:val="both"/>
       </w:pPr>
       <w:r>
-        <w:t xml:space="preserve">La progression du contenu au fil de la période s’appuie sur deux leviers :</w:t>
+        <w:t xml:space="preserve">L’apprentissage du BOA suit une progression : on n’attaque pas les enchaînements vers l’avant d’emblée, ils supposent un préalable technique.</w:t>
+      </w:r>
+    </w:p>
+    <w:p>
+      <w:pPr>
+        <w:pStyle w:val="Heading2"/>
+        <w:spacing w:after="80" w:before="240"/>
+      </w:pPr>
+      <w:r>
+        <w:rPr>
+          <w:b/>
+          <w:bCs/>
+          <w:color w:val="1F3864"/>
+          <w:sz w:val="24"/>
+          <w:szCs w:val="24"/>
+        </w:rPr>
+        <w:t xml:space="preserve">3.1 Le préalable : du volume avec intensité</w:t>
+      </w:r>
+    </w:p>
+    <w:p>
+      <w:pPr>
+        <w:spacing w:after="120" w:before="60" w:line="276"/>
+        <w:jc w:val="both"/>
+      </w:pPr>
+      <w:r>
+        <w:t xml:space="preserve">Le travail des enchaînements vers l’avant commence </w:t>
+      </w:r>
+      <w:r>
+        <w:rPr>
+          <w:b/>
+          <w:bCs/>
+        </w:rPr>
+        <w:t xml:space="preserve">lorsque le joueur est techniquement capable de mettre du volume avec intensité</w:t>
+      </w:r>
+      <w:r>
+        <w:t xml:space="preserve">. C’est le signal d’entrée dans cette étape : tant que ce socle n’est pas acquis, le travail reste sur la construction technique.</w:t>
+      </w:r>
+    </w:p>
+    <w:p>
+      <w:pPr>
+        <w:pStyle w:val="Heading2"/>
+        <w:spacing w:after="80" w:before="240"/>
+      </w:pPr>
+      <w:r>
+        <w:rPr>
+          <w:b/>
+          <w:bCs/>
+          <w:color w:val="1F3864"/>
+          <w:sz w:val="24"/>
+          <w:szCs w:val="24"/>
+        </w:rPr>
+        <w:t xml:space="preserve">3.2 Générer l’automatisme de l’accordéon</w:t>
+      </w:r>
+    </w:p>
+    <w:p>
+      <w:pPr>
+        <w:spacing w:after="120" w:before="60" w:line="276"/>
+        <w:jc w:val="both"/>
+      </w:pPr>
+      <w:r>
+        <w:t xml:space="preserve">On commence par générer l’</w:t>
+      </w:r>
+      <w:r>
+        <w:rPr>
+          <w:b/>
+          <w:bCs/>
+        </w:rPr>
+        <w:t xml:space="preserve">accordéon</w:t>
+      </w:r>
+      <w:r>
+        <w:t xml:space="preserve"> : </w:t>
+      </w:r>
+      <w:r>
+        <w:rPr>
+          <w:b/>
+          <w:bCs/>
+        </w:rPr>
+        <w:t xml:space="preserve">ne plus attendre la balle, mais chercher chaque fois à faire un pas vers elle</w:t>
+      </w:r>
+      <w:r>
+        <w:t xml:space="preserve">. Le joueur cesse de subir la trajectoire et va la prendre.</w:t>
+      </w:r>
+    </w:p>
+    <w:p>
+      <w:pPr>
+        <w:spacing w:after="120" w:before="60" w:line="276"/>
+        <w:jc w:val="both"/>
+      </w:pPr>
+      <w:r>
+        <w:t xml:space="preserve">Ce simple pas en avant produit deux effets, l’un sur soi, l’autre sur l’adversaire :</w:t>
       </w:r>
     </w:p>
     <w:p>
@@ -1687,10 +1776,10 @@
           <w:b/>
           <w:bCs/>
         </w:rPr>
-        <w:t xml:space="preserve">Jouer sur le temps — le principe de l’accordéon</w:t>
-      </w:r>
-      <w:r>
-        <w:t xml:space="preserve"> : enlever du temps pour contraindre la décision et l’exécution, puis le redonner pour consolider. L’alternance entre resserrement et relâchement structure la montée en charge.</w:t>
+        <w:t xml:space="preserve">Il améliore le transfert du poids du corps dans la balle</w:t>
+      </w:r>
+      <w:r>
+        <w:t xml:space="preserve"> : l’énergie produite part vers l’avant au lieu de se perdre.</w:t>
       </w:r>
     </w:p>
     <w:p>
@@ -1707,10 +1796,161 @@
           <w:b/>
           <w:bCs/>
         </w:rPr>
-        <w:t xml:space="preserve">Le travail des enchaînements</w:t>
-      </w:r>
-      <w:r>
-        <w:t xml:space="preserve">, d’abord vers l’avant, puis étendu à l’ensemble des situations. C’est le fil conducteur qui relie le travail technique au jeu réel.</w:t>
+        <w:t xml:space="preserve">Il enlève du temps à l’adversaire</w:t>
+      </w:r>
+      <w:r>
+        <w:t xml:space="preserve"> : la balle revient plus tôt, l’autre dispose de moins de temps pour se replacer et pour choisir.</w:t>
+      </w:r>
+    </w:p>
+    <w:p>
+      <w:pPr>
+        <w:spacing w:after="120" w:before="60" w:line="276"/>
+        <w:jc w:val="both"/>
+      </w:pPr>
+      <w:r>
+        <w:t xml:space="preserve">L’enjeu est d’en faire un </w:t>
+      </w:r>
+      <w:r>
+        <w:rPr>
+          <w:b/>
+          <w:bCs/>
+        </w:rPr>
+        <w:t xml:space="preserve">automatisme</w:t>
+      </w:r>
+      <w:r>
+        <w:t xml:space="preserve">. Il ne s’agit pas d’avancer quand on y pense, mais de </w:t>
+      </w:r>
+      <w:r>
+        <w:rPr>
+          <w:b/>
+          <w:bCs/>
+        </w:rPr>
+        <w:t xml:space="preserve">générer l’automatisme d’avancer en faisant « l’accordéon »</w:t>
+      </w:r>
+      <w:r>
+        <w:t xml:space="preserve">. Répété sur toutes les balles et dans toutes les situations, le pas en avant devient le réflexe par défaut : le joueur n’a plus à le décider, y compris lorsque la pression du match l’inciterait à reculer.</w:t>
+      </w:r>
+    </w:p>
+    <w:tbl>
+      <w:tblPr>
+        <w:tblW w:type="dxa" w:w="9070"/>
+        <w:tblBorders>
+          <w:top w:val="single" w:color="C9D3E6" w:sz="2"/>
+          <w:left w:val="single" w:color="1F3864" w:sz="18"/>
+          <w:bottom w:val="single" w:color="C9D3E6" w:sz="2"/>
+          <w:right w:val="single" w:color="C9D3E6" w:sz="2"/>
+          <w:insideH w:val="none" w:color="FFFFFF" w:sz="0"/>
+          <w:insideV w:val="none" w:color="FFFFFF" w:sz="0"/>
+        </w:tblBorders>
+      </w:tblPr>
+      <w:tblGrid>
+        <w:gridCol w:w="9070"/>
+      </w:tblGrid>
+      <w:tr>
+        <w:tc>
+          <w:tcPr>
+            <w:tcW w:type="dxa" w:w="9070"/>
+            <w:shd w:fill="F2F5FA" w:color="auto" w:val="clear"/>
+            <w:tcMar>
+              <w:top w:type="dxa" w:w="140"/>
+              <w:left w:type="dxa" w:w="180"/>
+              <w:bottom w:type="dxa" w:w="140"/>
+              <w:right w:type="dxa" w:w="180"/>
+            </w:tcMar>
+          </w:tcPr>
+          <w:p>
+            <w:r>
+              <w:rPr>
+                <w:b/>
+                <w:bCs/>
+                <w:color w:val="1F3864"/>
+                <w:sz w:val="20"/>
+                <w:szCs w:val="20"/>
+              </w:rPr>
+              <w:t xml:space="preserve">Le principe : </w:t>
+            </w:r>
+            <w:r>
+              <w:rPr>
+                <w:color w:val="262626"/>
+                <w:sz w:val="20"/>
+                <w:szCs w:val="20"/>
+              </w:rPr>
+              <w:t xml:space="preserve">générer l’automatisme d’avancer — un pas vers la balle sur chaque frappe. On gagne en transfert et l’on prend du temps à l’adversaire.</w:t>
+            </w:r>
+          </w:p>
+        </w:tc>
+      </w:tr>
+    </w:tbl>
+    <w:p>
+      <w:pPr>
+        <w:spacing w:after="120" w:before="60" w:line="276"/>
+        <w:jc w:val="both"/>
+      </w:pPr>
+      <w:r>
+        <w:t xml:space="preserve">Cette évolution se fait </w:t>
+      </w:r>
+      <w:r>
+        <w:rPr>
+          <w:b/>
+          <w:bCs/>
+        </w:rPr>
+        <w:t xml:space="preserve">sans perdre la solidité acquise avant</w:t>
+      </w:r>
+      <w:r>
+        <w:t xml:space="preserve">. L’accordéon ne doit se payer ni d’un retour des fautes, ni d’une baisse du volume : le pas en avant </w:t>
+      </w:r>
+      <w:r>
+        <w:rPr>
+          <w:b/>
+          <w:bCs/>
+        </w:rPr>
+        <w:t xml:space="preserve">s’ajoute</w:t>
+      </w:r>
+      <w:r>
+        <w:t xml:space="preserve"> au socle, il ne le remplace pas. Si la solidité recule, on revient la consolider avant de repousser l’exigence.</w:t>
+      </w:r>
+    </w:p>
+    <w:p>
+      <w:pPr>
+        <w:spacing w:after="160"/>
+      </w:pPr>
+      <w:r>
+        <w:t xml:space="preserve"/>
+      </w:r>
+    </w:p>
+    <w:p>
+      <w:pPr>
+        <w:pStyle w:val="Heading2"/>
+        <w:spacing w:after="80" w:before="240"/>
+      </w:pPr>
+      <w:r>
+        <w:rPr>
+          <w:b/>
+          <w:bCs/>
+          <w:color w:val="1F3864"/>
+          <w:sz w:val="24"/>
+          <w:szCs w:val="24"/>
+        </w:rPr>
+        <w:t xml:space="preserve">3.3 Le travail des enchaînements</w:t>
+      </w:r>
+    </w:p>
+    <w:p>
+      <w:pPr>
+        <w:spacing w:after="120" w:before="60" w:line="276"/>
+        <w:jc w:val="both"/>
+      </w:pPr>
+      <w:r>
+        <w:t xml:space="preserve">L’accordéon installé, le travail se poursuit sur les </w:t>
+      </w:r>
+      <w:r>
+        <w:rPr>
+          <w:b/>
+          <w:bCs/>
+        </w:rPr>
+        <w:t xml:space="preserve">enchaînements vers l’avant</w:t>
+      </w:r>
+      <w:r>
+        <w:t xml:space="preserve">, puis s’étend à l’ensemble des situations. C’est le fil conducteur qui relie le travail technique au jeu réel, et qui ramène le joueur vers le BOA visé.</w:t>
       </w:r>
     </w:p>
     <w:p>

</xml_diff>

<commit_message>
Section 1.3 reecrite: description complete de l'image de l'arbre
Le tronc = la solidite du joueur; les branches = les armes greffees dessus
(jeu d'attaque, croise court, amortie, volee). Un tronc mince fait tomber
l'arbre au moindre vent: la base de tout reste la solidite.

Co-Authored-By: Claude Opus 5 <noreply@anthropic.com>
Claude-Session: https://claude.ai/code/session_01MsQTwqEjmEDWzu5z6M6Ayx
</commit_message>
<xml_diff>
--- a/Projet_entrainement.docx
+++ b/Projet_entrainement.docx
@@ -450,17 +450,214 @@
         <w:jc w:val="both"/>
       </w:pPr>
       <w:r>
-        <w:t xml:space="preserve">L’</w:t>
-      </w:r>
-      <w:r>
-        <w:rPr>
-          <w:b/>
-          <w:bCs/>
-        </w:rPr>
-        <w:t xml:space="preserve">image de l’arbre</w:t>
-      </w:r>
-      <w:r>
-        <w:t xml:space="preserve"> sert de support de communication : un tronc commun — les principes qui ne bougent pas — et des branches, c’est-à-dire les variantes disponibles selon l’adversaire et le moment. Elle rend visible le fait qu’un même plan autorise plusieurs chemins.</w:t>
+        <w:t xml:space="preserve">Une autre image peut être utilisée, en complément du BOA et des animaux : celle de </w:t>
+      </w:r>
+      <w:r>
+        <w:rPr>
+          <w:b/>
+          <w:bCs/>
+        </w:rPr>
+        <w:t xml:space="preserve">l’arbre</w:t>
+      </w:r>
+      <w:r>
+        <w:t xml:space="preserve">.</w:t>
+      </w:r>
+    </w:p>
+    <w:p>
+      <w:pPr>
+        <w:spacing w:after="120" w:before="60" w:line="276"/>
+        <w:jc w:val="both"/>
+      </w:pPr>
+      <w:r>
+        <w:t xml:space="preserve">Le </w:t>
+      </w:r>
+      <w:r>
+        <w:rPr>
+          <w:b/>
+          <w:bCs/>
+        </w:rPr>
+        <w:t xml:space="preserve">tronc</w:t>
+      </w:r>
+      <w:r>
+        <w:t xml:space="preserve"> correspond à la </w:t>
+      </w:r>
+      <w:r>
+        <w:rPr>
+          <w:b/>
+          <w:bCs/>
+        </w:rPr>
+        <w:t xml:space="preserve">solidité du joueur</w:t>
+      </w:r>
+      <w:r>
+        <w:t xml:space="preserve">. Si le tronc est large, le joueur est solide : il peut y avoir de grosses tempêtes, il peut y avoir du vent, l’arbre ne tombera pas.</w:t>
+      </w:r>
+    </w:p>
+    <w:p>
+      <w:pPr>
+        <w:spacing w:after="120" w:before="60" w:line="276"/>
+        <w:jc w:val="both"/>
+      </w:pPr>
+      <w:r>
+        <w:t xml:space="preserve">Sur ce tronc solide, on vient </w:t>
+      </w:r>
+      <w:r>
+        <w:rPr>
+          <w:b/>
+          <w:bCs/>
+        </w:rPr>
+        <w:t xml:space="preserve">greffer des armes</w:t>
+      </w:r>
+      <w:r>
+        <w:t xml:space="preserve"> : ce sont les </w:t>
+      </w:r>
+      <w:r>
+        <w:rPr>
+          <w:b/>
+          <w:bCs/>
+        </w:rPr>
+        <w:t xml:space="preserve">branches</w:t>
+      </w:r>
+      <w:r>
+        <w:t xml:space="preserve">. Plus il y a de branches, plus le joueur est capable de </w:t>
+      </w:r>
+      <w:r>
+        <w:rPr>
+          <w:b/>
+          <w:bCs/>
+        </w:rPr>
+        <w:t xml:space="preserve">varier ses intentions</w:t>
+      </w:r>
+      <w:r>
+        <w:t xml:space="preserve">. Une branche, ce peut être :</w:t>
+      </w:r>
+    </w:p>
+    <w:p>
+      <w:pPr>
+        <w:pStyle w:val="ListParagraph"/>
+        <w:numPr>
+          <w:ilvl w:val="0"/>
+          <w:numId w:val="2"/>
+        </w:numPr>
+        <w:spacing w:after="50" w:before="50" w:line="264"/>
+      </w:pPr>
+      <w:r>
+        <w:t xml:space="preserve">Le jeu d’attaque.</w:t>
+      </w:r>
+    </w:p>
+    <w:p>
+      <w:pPr>
+        <w:pStyle w:val="ListParagraph"/>
+        <w:numPr>
+          <w:ilvl w:val="0"/>
+          <w:numId w:val="2"/>
+        </w:numPr>
+        <w:spacing w:after="50" w:before="50" w:line="264"/>
+      </w:pPr>
+      <w:r>
+        <w:t xml:space="preserve">Être capable de faire un croisé court.</w:t>
+      </w:r>
+    </w:p>
+    <w:p>
+      <w:pPr>
+        <w:pStyle w:val="ListParagraph"/>
+        <w:numPr>
+          <w:ilvl w:val="0"/>
+          <w:numId w:val="2"/>
+        </w:numPr>
+        <w:spacing w:after="50" w:before="50" w:line="264"/>
+      </w:pPr>
+      <w:r>
+        <w:t xml:space="preserve">Être capable de faire une amortie.</w:t>
+      </w:r>
+    </w:p>
+    <w:p>
+      <w:pPr>
+        <w:pStyle w:val="ListParagraph"/>
+        <w:numPr>
+          <w:ilvl w:val="0"/>
+          <w:numId w:val="2"/>
+        </w:numPr>
+        <w:spacing w:after="50" w:before="50" w:line="264"/>
+      </w:pPr>
+      <w:r>
+        <w:t xml:space="preserve">Avoir une bonne volée.</w:t>
+      </w:r>
+    </w:p>
+    <w:p>
+      <w:pPr>
+        <w:spacing w:after="120" w:before="60" w:line="276"/>
+        <w:jc w:val="both"/>
+      </w:pPr>
+      <w:r>
+        <w:t xml:space="preserve">Mais si le joueur a plein de branches — il sait attaquer, il frappe fort — et que </w:t>
+      </w:r>
+      <w:r>
+        <w:rPr>
+          <w:b/>
+          <w:bCs/>
+        </w:rPr>
+        <w:t xml:space="preserve">son tronc est très mince</w:t>
+      </w:r>
+      <w:r>
+        <w:t xml:space="preserve">, l’arbre tombera dès qu’il n’est pas en forme : au moindre coup de vent, il tombe. Les armes ne tiennent que par ce qui les porte.</w:t>
+      </w:r>
+    </w:p>
+    <w:tbl>
+      <w:tblPr>
+        <w:tblW w:type="dxa" w:w="9070"/>
+        <w:tblBorders>
+          <w:top w:val="single" w:color="C9D3E6" w:sz="2"/>
+          <w:left w:val="single" w:color="1F3864" w:sz="18"/>
+          <w:bottom w:val="single" w:color="C9D3E6" w:sz="2"/>
+          <w:right w:val="single" w:color="C9D3E6" w:sz="2"/>
+          <w:insideH w:val="none" w:color="FFFFFF" w:sz="0"/>
+          <w:insideV w:val="none" w:color="FFFFFF" w:sz="0"/>
+        </w:tblBorders>
+      </w:tblPr>
+      <w:tblGrid>
+        <w:gridCol w:w="9070"/>
+      </w:tblGrid>
+      <w:tr>
+        <w:tc>
+          <w:tcPr>
+            <w:tcW w:type="dxa" w:w="9070"/>
+            <w:shd w:fill="F2F5FA" w:color="auto" w:val="clear"/>
+            <w:tcMar>
+              <w:top w:type="dxa" w:w="140"/>
+              <w:left w:type="dxa" w:w="180"/>
+              <w:bottom w:type="dxa" w:w="140"/>
+              <w:right w:type="dxa" w:w="180"/>
+            </w:tcMar>
+          </w:tcPr>
+          <w:p>
+            <w:r>
+              <w:rPr>
+                <w:b/>
+                <w:bCs/>
+                <w:color w:val="1F3864"/>
+                <w:sz w:val="20"/>
+                <w:szCs w:val="20"/>
+              </w:rPr>
+              <w:t xml:space="preserve">La base de tout : </w:t>
+            </w:r>
+            <w:r>
+              <w:rPr>
+                <w:color w:val="262626"/>
+                <w:sz w:val="20"/>
+                <w:szCs w:val="20"/>
+              </w:rPr>
+              <w:t xml:space="preserve">la solidité, c’est le tronc. On élargit le tronc avant d’ajouter des branches — et on continue de l’élargir à mesure qu’on en ajoute.</w:t>
+            </w:r>
+          </w:p>
+        </w:tc>
+      </w:tr>
+    </w:tbl>
+    <w:p>
+      <w:pPr>
+        <w:spacing w:after="160"/>
+      </w:pPr>
+      <w:r>
+        <w:t xml:space="preserve"/>
       </w:r>
     </w:p>
     <w:p>

</xml_diff>

<commit_message>
Definition du BOA et restructuration de la section 1.4
Le tableau a completer est remplace par un bloc par profil (image de
l'animal + traduction sur le court). Le BOA est renseigne: volume agressif
qui protege et genere la balle courte, puis conclusion en une ou deux
frappes (attaque et volee). Les cinq autres profils restent a completer.

Co-Authored-By: Claude Opus 5 <noreply@anthropic.com>
Claude-Session: https://claude.ai/code/session_01MsQTwqEjmEDWzu5z6M6Ayx
</commit_message>
<xml_diff>
--- a/Projet_entrainement.docx
+++ b/Projet_entrainement.docx
@@ -673,16 +673,163 @@
           <w:sz w:val="24"/>
           <w:szCs w:val="24"/>
         </w:rPr>
-        <w:t xml:space="preserve">1.4 Définitions — à compléter</w:t>
-      </w:r>
-    </w:p>
-    <w:p>
-      <w:pPr>
-        <w:spacing w:after="120" w:before="60" w:line="276"/>
-        <w:jc w:val="both"/>
-      </w:pPr>
-      <w:r>
-        <w:t xml:space="preserve">Chaque terme sera défini et illustré : comportements caractéristiques, situations où le profil est pertinent, réponses à lui opposer, et forme que prend son BOA ascendant. Les définitions restent à écrire.</w:t>
+        <w:t xml:space="preserve">1.4 Définition des profils</w:t>
+      </w:r>
+    </w:p>
+    <w:p>
+      <w:pPr>
+        <w:spacing w:after="120" w:before="60" w:line="276"/>
+        <w:jc w:val="both"/>
+      </w:pPr>
+      <w:r>
+        <w:t xml:space="preserve">Chaque profil est décrit par l’image de l’animal, puis par sa traduction sur le court.</w:t>
+      </w:r>
+    </w:p>
+    <w:p>
+      <w:pPr>
+        <w:pStyle w:val="Heading3"/>
+        <w:spacing w:after="60" w:before="260"/>
+      </w:pPr>
+      <w:r>
+        <w:rPr>
+          <w:b/>
+          <w:bCs/>
+          <w:color w:val="1F3864"/>
+          <w:sz w:val="22"/>
+          <w:szCs w:val="22"/>
+        </w:rPr>
+        <w:t xml:space="preserve">Le BOA</w:t>
+      </w:r>
+    </w:p>
+    <w:p>
+      <w:pPr>
+        <w:spacing w:after="120" w:before="60" w:line="276"/>
+        <w:jc w:val="both"/>
+      </w:pPr>
+      <w:r>
+        <w:rPr>
+          <w:b/>
+          <w:bCs/>
+        </w:rPr>
+        <w:t xml:space="preserve">L’image. </w:t>
+      </w:r>
+      <w:r>
+        <w:t xml:space="preserve">Le boa </w:t>
+      </w:r>
+      <w:r>
+        <w:rPr>
+          <w:b/>
+          <w:bCs/>
+        </w:rPr>
+        <w:t xml:space="preserve">entoure sa proie très solidement</w:t>
+      </w:r>
+      <w:r>
+        <w:t xml:space="preserve">. Il l’entoure, il l’entoure encore, jusqu’à ce qu’elle ne puisse plus bouger et se retrouve complètement sous son emprise. Puis, à un certain moment — bam — il serre : il tue sa proie en portant le coup de grâce.</w:t>
+      </w:r>
+    </w:p>
+    <w:p>
+      <w:pPr>
+        <w:spacing w:after="120" w:before="60" w:line="276"/>
+        <w:jc w:val="both"/>
+      </w:pPr>
+      <w:r>
+        <w:rPr>
+          <w:b/>
+          <w:bCs/>
+        </w:rPr>
+        <w:t xml:space="preserve">Sur le court. </w:t>
+      </w:r>
+      <w:r>
+        <w:t xml:space="preserve">C’est le joueur qui met un </w:t>
+      </w:r>
+      <w:r>
+        <w:rPr>
+          <w:b/>
+          <w:bCs/>
+        </w:rPr>
+        <w:t xml:space="preserve">volume agressif</w:t>
+      </w:r>
+      <w:r>
+        <w:t xml:space="preserve"> et qui distribue tout en mettant ce volume. Ce volume lui rend deux services :</w:t>
+      </w:r>
+    </w:p>
+    <w:p>
+      <w:pPr>
+        <w:pStyle w:val="ListParagraph"/>
+        <w:numPr>
+          <w:ilvl w:val="0"/>
+          <w:numId w:val="2"/>
+        </w:numPr>
+        <w:spacing w:after="50" w:before="50" w:line="264"/>
+      </w:pPr>
+      <w:r>
+        <w:rPr>
+          <w:b/>
+          <w:bCs/>
+        </w:rPr>
+        <w:t xml:space="preserve">Il le protège</w:t>
+      </w:r>
+      <w:r>
+        <w:t xml:space="preserve"> : l’adversaire, enfermé, ne peut pas attaquer.</w:t>
+      </w:r>
+    </w:p>
+    <w:p>
+      <w:pPr>
+        <w:pStyle w:val="ListParagraph"/>
+        <w:numPr>
+          <w:ilvl w:val="0"/>
+          <w:numId w:val="2"/>
+        </w:numPr>
+        <w:spacing w:after="50" w:before="50" w:line="264"/>
+      </w:pPr>
+      <w:r>
+        <w:rPr>
+          <w:b/>
+          <w:bCs/>
+        </w:rPr>
+        <w:t xml:space="preserve">Il génère une balle courte</w:t>
+      </w:r>
+      <w:r>
+        <w:t xml:space="preserve"> : à force d’être pressé, l’adversaire finit par rendre une balle exploitable.</w:t>
+      </w:r>
+    </w:p>
+    <w:p>
+      <w:pPr>
+        <w:spacing w:after="120" w:before="60" w:line="276"/>
+        <w:jc w:val="both"/>
+      </w:pPr>
+      <w:r>
+        <w:t xml:space="preserve">Et quand la balle courte arrive — bam. Le joueur doit être capable de </w:t>
+      </w:r>
+      <w:r>
+        <w:rPr>
+          <w:b/>
+          <w:bCs/>
+        </w:rPr>
+        <w:t xml:space="preserve">terminer le point en une ou deux frappes de balle</w:t>
+      </w:r>
+      <w:r>
+        <w:t xml:space="preserve">. C’est le coup de grâce du boa. Cela suppose donc une </w:t>
+      </w:r>
+      <w:r>
+        <w:rPr>
+          <w:b/>
+          <w:bCs/>
+        </w:rPr>
+        <w:t xml:space="preserve">bonne attaque</w:t>
+      </w:r>
+      <w:r>
+        <w:t xml:space="preserve"> et une </w:t>
+      </w:r>
+      <w:r>
+        <w:rPr>
+          <w:b/>
+          <w:bCs/>
+        </w:rPr>
+        <w:t xml:space="preserve">bonne volée</w:t>
+      </w:r>
+      <w:r>
+        <w:t xml:space="preserve">.</w:t>
       </w:r>
     </w:p>
     <w:tbl>
@@ -690,27 +837,26 @@
         <w:tblW w:type="dxa" w:w="9070"/>
         <w:tblBorders>
           <w:top w:val="single" w:color="C9D3E6" w:sz="2"/>
-          <w:left w:val="single" w:color="C9D3E6" w:sz="2"/>
+          <w:left w:val="single" w:color="1F3864" w:sz="18"/>
           <w:bottom w:val="single" w:color="C9D3E6" w:sz="2"/>
           <w:right w:val="single" w:color="C9D3E6" w:sz="2"/>
-          <w:insideH w:val="single" w:color="C9D3E6" w:sz="2"/>
-          <w:insideV w:val="single" w:color="C9D3E6" w:sz="2"/>
+          <w:insideH w:val="none" w:color="FFFFFF" w:sz="0"/>
+          <w:insideV w:val="none" w:color="FFFFFF" w:sz="0"/>
         </w:tblBorders>
       </w:tblPr>
       <w:tblGrid>
-        <w:gridCol w:w="2400"/>
-        <w:gridCol w:w="6670"/>
+        <w:gridCol w:w="9070"/>
       </w:tblGrid>
       <w:tr>
         <w:tc>
           <w:tcPr>
-            <w:tcW w:type="dxa" w:w="2400"/>
+            <w:tcW w:type="dxa" w:w="9070"/>
             <w:shd w:fill="F2F5FA" w:color="auto" w:val="clear"/>
             <w:tcMar>
-              <w:top w:type="dxa" w:w="160"/>
-              <w:left w:type="dxa" w:w="160"/>
-              <w:bottom w:type="dxa" w:w="160"/>
-              <w:right w:type="dxa" w:w="120"/>
+              <w:top w:type="dxa" w:w="140"/>
+              <w:left w:type="dxa" w:w="180"/>
+              <w:bottom w:type="dxa" w:w="140"/>
+              <w:right w:type="dxa" w:w="180"/>
             </w:tcMar>
           </w:tcPr>
           <w:p>
@@ -719,343 +865,186 @@
                 <w:b/>
                 <w:bCs/>
                 <w:color w:val="1F3864"/>
-                <w:sz w:val="22"/>
-                <w:szCs w:val="22"/>
+                <w:sz w:val="20"/>
+                <w:szCs w:val="20"/>
               </w:rPr>
-              <w:t xml:space="preserve">Le BOA</w:t>
+              <w:t xml:space="preserve">Le BOA le plus complet possible : </w:t>
             </w:r>
-          </w:p>
-        </w:tc>
-        <w:tc>
-          <w:tcPr>
-            <w:tcW w:type="dxa" w:w="6670"/>
-            <w:tcMar>
-              <w:top w:type="dxa" w:w="160"/>
-              <w:left w:type="dxa" w:w="160"/>
-              <w:bottom w:type="dxa" w:w="160"/>
-              <w:right w:type="dxa" w:w="160"/>
-            </w:tcMar>
-          </w:tcPr>
-          <w:p>
             <w:r>
               <w:rPr>
-                <w:i/>
-                <w:iCs/>
-                <w:color w:val="8C8C8C"/>
-                <w:sz w:val="19"/>
-                <w:szCs w:val="19"/>
+                <w:color w:val="262626"/>
+                <w:sz w:val="20"/>
+                <w:szCs w:val="20"/>
               </w:rPr>
-              <w:t xml:space="preserve">À compléter — définition générale et ce que recouvre le sigle.</w:t>
-            </w:r>
-          </w:p>
-          <w:p>
-            <w:r>
-              <w:t xml:space="preserve"/>
-            </w:r>
-          </w:p>
-          <w:p>
-            <w:r>
-              <w:t xml:space="preserve"/>
-            </w:r>
-          </w:p>
-        </w:tc>
-      </w:tr>
-      <w:tr>
-        <w:tc>
-          <w:tcPr>
-            <w:tcW w:type="dxa" w:w="2400"/>
-            <w:shd w:fill="F2F5FA" w:color="auto" w:val="clear"/>
-            <w:tcMar>
-              <w:top w:type="dxa" w:w="160"/>
-              <w:left w:type="dxa" w:w="160"/>
-              <w:bottom w:type="dxa" w:w="160"/>
-              <w:right w:type="dxa" w:w="120"/>
-            </w:tcMar>
-          </w:tcPr>
-          <w:p>
-            <w:r>
-              <w:rPr>
-                <w:b/>
-                <w:bCs/>
-                <w:color w:val="1F3864"/>
-                <w:sz w:val="22"/>
-                <w:szCs w:val="22"/>
-              </w:rPr>
-              <w:t xml:space="preserve">Le lion</w:t>
-            </w:r>
-          </w:p>
-        </w:tc>
-        <w:tc>
-          <w:tcPr>
-            <w:tcW w:type="dxa" w:w="6670"/>
-            <w:tcMar>
-              <w:top w:type="dxa" w:w="160"/>
-              <w:left w:type="dxa" w:w="160"/>
-              <w:bottom w:type="dxa" w:w="160"/>
-              <w:right w:type="dxa" w:w="160"/>
-            </w:tcMar>
-          </w:tcPr>
-          <w:p>
-            <w:r>
-              <w:rPr>
-                <w:i/>
-                <w:iCs/>
-                <w:color w:val="8C8C8C"/>
-                <w:sz w:val="19"/>
-                <w:szCs w:val="19"/>
-              </w:rPr>
-              <w:t xml:space="preserve">À compléter.</w:t>
-            </w:r>
-          </w:p>
-          <w:p>
-            <w:r>
-              <w:t xml:space="preserve"/>
-            </w:r>
-          </w:p>
-          <w:p>
-            <w:r>
-              <w:t xml:space="preserve"/>
-            </w:r>
-          </w:p>
-        </w:tc>
-      </w:tr>
-      <w:tr>
-        <w:tc>
-          <w:tcPr>
-            <w:tcW w:type="dxa" w:w="2400"/>
-            <w:shd w:fill="F2F5FA" w:color="auto" w:val="clear"/>
-            <w:tcMar>
-              <w:top w:type="dxa" w:w="160"/>
-              <w:left w:type="dxa" w:w="160"/>
-              <w:bottom w:type="dxa" w:w="160"/>
-              <w:right w:type="dxa" w:w="120"/>
-            </w:tcMar>
-          </w:tcPr>
-          <w:p>
-            <w:r>
-              <w:rPr>
-                <w:b/>
-                <w:bCs/>
-                <w:color w:val="1F3864"/>
-                <w:sz w:val="22"/>
-                <w:szCs w:val="22"/>
-              </w:rPr>
-              <w:t xml:space="preserve">Le renard</w:t>
-            </w:r>
-          </w:p>
-        </w:tc>
-        <w:tc>
-          <w:tcPr>
-            <w:tcW w:type="dxa" w:w="6670"/>
-            <w:tcMar>
-              <w:top w:type="dxa" w:w="160"/>
-              <w:left w:type="dxa" w:w="160"/>
-              <w:bottom w:type="dxa" w:w="160"/>
-              <w:right w:type="dxa" w:w="160"/>
-            </w:tcMar>
-          </w:tcPr>
-          <w:p>
-            <w:r>
-              <w:rPr>
-                <w:i/>
-                <w:iCs/>
-                <w:color w:val="8C8C8C"/>
-                <w:sz w:val="19"/>
-                <w:szCs w:val="19"/>
-              </w:rPr>
-              <w:t xml:space="preserve">À compléter.</w:t>
-            </w:r>
-          </w:p>
-          <w:p>
-            <w:r>
-              <w:t xml:space="preserve"/>
-            </w:r>
-          </w:p>
-          <w:p>
-            <w:r>
-              <w:t xml:space="preserve"/>
-            </w:r>
-          </w:p>
-        </w:tc>
-      </w:tr>
-      <w:tr>
-        <w:tc>
-          <w:tcPr>
-            <w:tcW w:type="dxa" w:w="2400"/>
-            <w:shd w:fill="F2F5FA" w:color="auto" w:val="clear"/>
-            <w:tcMar>
-              <w:top w:type="dxa" w:w="160"/>
-              <w:left w:type="dxa" w:w="160"/>
-              <w:bottom w:type="dxa" w:w="160"/>
-              <w:right w:type="dxa" w:w="120"/>
-            </w:tcMar>
-          </w:tcPr>
-          <w:p>
-            <w:r>
-              <w:rPr>
-                <w:b/>
-                <w:bCs/>
-                <w:color w:val="1F3864"/>
-                <w:sz w:val="22"/>
-                <w:szCs w:val="22"/>
-              </w:rPr>
-              <w:t xml:space="preserve">Le magicien</w:t>
-            </w:r>
-          </w:p>
-        </w:tc>
-        <w:tc>
-          <w:tcPr>
-            <w:tcW w:type="dxa" w:w="6670"/>
-            <w:tcMar>
-              <w:top w:type="dxa" w:w="160"/>
-              <w:left w:type="dxa" w:w="160"/>
-              <w:bottom w:type="dxa" w:w="160"/>
-              <w:right w:type="dxa" w:w="160"/>
-            </w:tcMar>
-          </w:tcPr>
-          <w:p>
-            <w:r>
-              <w:rPr>
-                <w:i/>
-                <w:iCs/>
-                <w:color w:val="8C8C8C"/>
-                <w:sz w:val="19"/>
-                <w:szCs w:val="19"/>
-              </w:rPr>
-              <w:t xml:space="preserve">À compléter.</w:t>
-            </w:r>
-          </w:p>
-          <w:p>
-            <w:r>
-              <w:t xml:space="preserve"/>
-            </w:r>
-          </w:p>
-          <w:p>
-            <w:r>
-              <w:t xml:space="preserve"/>
-            </w:r>
-          </w:p>
-        </w:tc>
-      </w:tr>
-      <w:tr>
-        <w:tc>
-          <w:tcPr>
-            <w:tcW w:type="dxa" w:w="2400"/>
-            <w:shd w:fill="F2F5FA" w:color="auto" w:val="clear"/>
-            <w:tcMar>
-              <w:top w:type="dxa" w:w="160"/>
-              <w:left w:type="dxa" w:w="160"/>
-              <w:bottom w:type="dxa" w:w="160"/>
-              <w:right w:type="dxa" w:w="120"/>
-            </w:tcMar>
-          </w:tcPr>
-          <w:p>
-            <w:r>
-              <w:rPr>
-                <w:b/>
-                <w:bCs/>
-                <w:color w:val="1F3864"/>
-                <w:sz w:val="22"/>
-                <w:szCs w:val="22"/>
-              </w:rPr>
-              <w:t xml:space="preserve">Le mur</w:t>
-            </w:r>
-          </w:p>
-        </w:tc>
-        <w:tc>
-          <w:tcPr>
-            <w:tcW w:type="dxa" w:w="6670"/>
-            <w:tcMar>
-              <w:top w:type="dxa" w:w="160"/>
-              <w:left w:type="dxa" w:w="160"/>
-              <w:bottom w:type="dxa" w:w="160"/>
-              <w:right w:type="dxa" w:w="160"/>
-            </w:tcMar>
-          </w:tcPr>
-          <w:p>
-            <w:r>
-              <w:rPr>
-                <w:i/>
-                <w:iCs/>
-                <w:color w:val="8C8C8C"/>
-                <w:sz w:val="19"/>
-                <w:szCs w:val="19"/>
-              </w:rPr>
-              <w:t xml:space="preserve">À compléter.</w:t>
-            </w:r>
-          </w:p>
-          <w:p>
-            <w:r>
-              <w:t xml:space="preserve"/>
-            </w:r>
-          </w:p>
-          <w:p>
-            <w:r>
-              <w:t xml:space="preserve"/>
-            </w:r>
-          </w:p>
-        </w:tc>
-      </w:tr>
-      <w:tr>
-        <w:tc>
-          <w:tcPr>
-            <w:tcW w:type="dxa" w:w="2400"/>
-            <w:shd w:fill="F2F5FA" w:color="auto" w:val="clear"/>
-            <w:tcMar>
-              <w:top w:type="dxa" w:w="160"/>
-              <w:left w:type="dxa" w:w="160"/>
-              <w:bottom w:type="dxa" w:w="160"/>
-              <w:right w:type="dxa" w:w="120"/>
-            </w:tcMar>
-          </w:tcPr>
-          <w:p>
-            <w:r>
-              <w:rPr>
-                <w:b/>
-                <w:bCs/>
-                <w:color w:val="1F3864"/>
-                <w:sz w:val="22"/>
-                <w:szCs w:val="22"/>
-              </w:rPr>
-              <w:t xml:space="preserve">Le caméléon</w:t>
-            </w:r>
-          </w:p>
-        </w:tc>
-        <w:tc>
-          <w:tcPr>
-            <w:tcW w:type="dxa" w:w="6670"/>
-            <w:tcMar>
-              <w:top w:type="dxa" w:w="160"/>
-              <w:left w:type="dxa" w:w="160"/>
-              <w:bottom w:type="dxa" w:w="160"/>
-              <w:right w:type="dxa" w:w="160"/>
-            </w:tcMar>
-          </w:tcPr>
-          <w:p>
-            <w:r>
-              <w:rPr>
-                <w:i/>
-                <w:iCs/>
-                <w:color w:val="8C8C8C"/>
-                <w:sz w:val="19"/>
-                <w:szCs w:val="19"/>
-              </w:rPr>
-              <w:t xml:space="preserve">À compléter.</w:t>
-            </w:r>
-          </w:p>
-          <w:p>
-            <w:r>
-              <w:t xml:space="preserve"/>
-            </w:r>
-          </w:p>
-          <w:p>
-            <w:r>
-              <w:t xml:space="preserve"/>
+              <w:t xml:space="preserve">un volume agressif pour enfermer l’adversaire et faire venir la balle courte, une attaque et une volée pour conclure en une ou deux frappes.</w:t>
             </w:r>
           </w:p>
         </w:tc>
       </w:tr>
     </w:tbl>
+    <w:p>
+      <w:pPr>
+        <w:spacing w:after="160"/>
+      </w:pPr>
+      <w:r>
+        <w:t xml:space="preserve"/>
+      </w:r>
+    </w:p>
+    <w:p>
+      <w:pPr>
+        <w:pStyle w:val="Heading3"/>
+        <w:spacing w:after="60" w:before="260"/>
+      </w:pPr>
+      <w:r>
+        <w:rPr>
+          <w:b/>
+          <w:bCs/>
+          <w:color w:val="1F3864"/>
+          <w:sz w:val="22"/>
+          <w:szCs w:val="22"/>
+        </w:rPr>
+        <w:t xml:space="preserve">Le lion</w:t>
+      </w:r>
+    </w:p>
+    <w:p>
+      <w:pPr>
+        <w:spacing w:after="120" w:before="40"/>
+      </w:pPr>
+      <w:r>
+        <w:rPr>
+          <w:i/>
+          <w:iCs/>
+          <w:color w:val="8C8C8C"/>
+          <w:sz w:val="20"/>
+          <w:szCs w:val="20"/>
+        </w:rPr>
+        <w:t xml:space="preserve">À compléter.</w:t>
+      </w:r>
+    </w:p>
+    <w:p>
+      <w:pPr>
+        <w:pStyle w:val="Heading3"/>
+        <w:spacing w:after="60" w:before="260"/>
+      </w:pPr>
+      <w:r>
+        <w:rPr>
+          <w:b/>
+          <w:bCs/>
+          <w:color w:val="1F3864"/>
+          <w:sz w:val="22"/>
+          <w:szCs w:val="22"/>
+        </w:rPr>
+        <w:t xml:space="preserve">Le renard</w:t>
+      </w:r>
+    </w:p>
+    <w:p>
+      <w:pPr>
+        <w:spacing w:after="120" w:before="40"/>
+      </w:pPr>
+      <w:r>
+        <w:rPr>
+          <w:i/>
+          <w:iCs/>
+          <w:color w:val="8C8C8C"/>
+          <w:sz w:val="20"/>
+          <w:szCs w:val="20"/>
+        </w:rPr>
+        <w:t xml:space="preserve">À compléter.</w:t>
+      </w:r>
+    </w:p>
+    <w:p>
+      <w:pPr>
+        <w:pStyle w:val="Heading3"/>
+        <w:spacing w:after="60" w:before="260"/>
+      </w:pPr>
+      <w:r>
+        <w:rPr>
+          <w:b/>
+          <w:bCs/>
+          <w:color w:val="1F3864"/>
+          <w:sz w:val="22"/>
+          <w:szCs w:val="22"/>
+        </w:rPr>
+        <w:t xml:space="preserve">Le magicien</w:t>
+      </w:r>
+    </w:p>
+    <w:p>
+      <w:pPr>
+        <w:spacing w:after="120" w:before="40"/>
+      </w:pPr>
+      <w:r>
+        <w:rPr>
+          <w:i/>
+          <w:iCs/>
+          <w:color w:val="8C8C8C"/>
+          <w:sz w:val="20"/>
+          <w:szCs w:val="20"/>
+        </w:rPr>
+        <w:t xml:space="preserve">À compléter.</w:t>
+      </w:r>
+    </w:p>
+    <w:p>
+      <w:pPr>
+        <w:pStyle w:val="Heading3"/>
+        <w:spacing w:after="60" w:before="260"/>
+      </w:pPr>
+      <w:r>
+        <w:rPr>
+          <w:b/>
+          <w:bCs/>
+          <w:color w:val="1F3864"/>
+          <w:sz w:val="22"/>
+          <w:szCs w:val="22"/>
+        </w:rPr>
+        <w:t xml:space="preserve">Le mur</w:t>
+      </w:r>
+    </w:p>
+    <w:p>
+      <w:pPr>
+        <w:spacing w:after="120" w:before="40"/>
+      </w:pPr>
+      <w:r>
+        <w:rPr>
+          <w:i/>
+          <w:iCs/>
+          <w:color w:val="8C8C8C"/>
+          <w:sz w:val="20"/>
+          <w:szCs w:val="20"/>
+        </w:rPr>
+        <w:t xml:space="preserve">À compléter.</w:t>
+      </w:r>
+    </w:p>
+    <w:p>
+      <w:pPr>
+        <w:pStyle w:val="Heading3"/>
+        <w:spacing w:after="60" w:before="260"/>
+      </w:pPr>
+      <w:r>
+        <w:rPr>
+          <w:b/>
+          <w:bCs/>
+          <w:color w:val="1F3864"/>
+          <w:sz w:val="22"/>
+          <w:szCs w:val="22"/>
+        </w:rPr>
+        <w:t xml:space="preserve">Le caméléon</w:t>
+      </w:r>
+    </w:p>
+    <w:p>
+      <w:pPr>
+        <w:spacing w:after="120" w:before="40"/>
+      </w:pPr>
+      <w:r>
+        <w:rPr>
+          <w:i/>
+          <w:iCs/>
+          <w:color w:val="8C8C8C"/>
+          <w:sz w:val="20"/>
+          <w:szCs w:val="20"/>
+        </w:rPr>
+        <w:t xml:space="preserve">À compléter.</w:t>
+      </w:r>
+    </w:p>
     <w:p>
       <w:pPr>
         <w:spacing w:after="160"/>

</xml_diff>

<commit_message>
Definitions du lion et du magicien
Lion: tres offensif, agresse des le service ou le retour, cherche a
conclure en deux ou trois frappes; jeu a risque.
Magicien: amorties, croises courts, amortie-lob, slices, variation
permanente.

Co-Authored-By: Claude Opus 5 <noreply@anthropic.com>
Claude-Session: https://claude.ai/code/session_01MsQTwqEjmEDWzu5z6M6Ayx
</commit_message>
<xml_diff>
--- a/Projet_entrainement.docx
+++ b/Projet_entrainement.docx
@@ -908,6 +908,132 @@
     </w:p>
     <w:p>
       <w:pPr>
+        <w:spacing w:after="120" w:before="60" w:line="276"/>
+        <w:jc w:val="both"/>
+      </w:pPr>
+      <w:r>
+        <w:rPr>
+          <w:b/>
+          <w:bCs/>
+        </w:rPr>
+        <w:t xml:space="preserve">L’image. </w:t>
+      </w:r>
+      <w:r>
+        <w:t xml:space="preserve">Le lion chasse à découvert. Il ne cherche pas à enfermer sa proie : il fond dessus et règle l’affaire en quelques secondes.</w:t>
+      </w:r>
+    </w:p>
+    <w:p>
+      <w:pPr>
+        <w:spacing w:after="120" w:before="60" w:line="276"/>
+        <w:jc w:val="both"/>
+      </w:pPr>
+      <w:r>
+        <w:rPr>
+          <w:b/>
+          <w:bCs/>
+        </w:rPr>
+        <w:t xml:space="preserve">Sur le court. </w:t>
+      </w:r>
+      <w:r>
+        <w:t xml:space="preserve">C’est quelqu’un qui </w:t>
+      </w:r>
+      <w:r>
+        <w:rPr>
+          <w:b/>
+          <w:bCs/>
+        </w:rPr>
+        <w:t xml:space="preserve">va attaquer</w:t>
+      </w:r>
+      <w:r>
+        <w:t xml:space="preserve">. Très offensif, il cherche à </w:t>
+      </w:r>
+      <w:r>
+        <w:rPr>
+          <w:b/>
+          <w:bCs/>
+        </w:rPr>
+        <w:t xml:space="preserve">terminer le point en deux ou trois frappes de balle</w:t>
+      </w:r>
+      <w:r>
+        <w:t xml:space="preserve">. Dès le service ou dès le retour de service, il agresse l’adversaire : il prend l’initiative immédiatement, sans passer par une phase de construction.</w:t>
+      </w:r>
+    </w:p>
+    <w:tbl>
+      <w:tblPr>
+        <w:tblW w:type="dxa" w:w="9070"/>
+        <w:tblBorders>
+          <w:top w:val="single" w:color="C9D3E6" w:sz="2"/>
+          <w:left w:val="single" w:color="1F3864" w:sz="18"/>
+          <w:bottom w:val="single" w:color="C9D3E6" w:sz="2"/>
+          <w:right w:val="single" w:color="C9D3E6" w:sz="2"/>
+          <w:insideH w:val="none" w:color="FFFFFF" w:sz="0"/>
+          <w:insideV w:val="none" w:color="FFFFFF" w:sz="0"/>
+        </w:tblBorders>
+      </w:tblPr>
+      <w:tblGrid>
+        <w:gridCol w:w="9070"/>
+      </w:tblGrid>
+      <w:tr>
+        <w:tc>
+          <w:tcPr>
+            <w:tcW w:type="dxa" w:w="9070"/>
+            <w:shd w:fill="F2F5FA" w:color="auto" w:val="clear"/>
+            <w:tcMar>
+              <w:top w:type="dxa" w:w="140"/>
+              <w:left w:type="dxa" w:w="180"/>
+              <w:bottom w:type="dxa" w:w="140"/>
+              <w:right w:type="dxa" w:w="180"/>
+            </w:tcMar>
+          </w:tcPr>
+          <w:p>
+            <w:r>
+              <w:rPr>
+                <w:b/>
+                <w:bCs/>
+                <w:color w:val="1F3864"/>
+                <w:sz w:val="20"/>
+                <w:szCs w:val="20"/>
+              </w:rPr>
+              <w:t xml:space="preserve">À noter : </w:t>
+            </w:r>
+            <w:r>
+              <w:rPr>
+                <w:color w:val="262626"/>
+                <w:sz w:val="20"/>
+                <w:szCs w:val="20"/>
+              </w:rPr>
+              <w:t xml:space="preserve">c’est un jeu à risque — quand il passe, le point est plié ; quand il ne passe pas, la faute arrive vite.</w:t>
+            </w:r>
+          </w:p>
+        </w:tc>
+      </w:tr>
+    </w:tbl>
+    <w:p>
+      <w:pPr>
+        <w:spacing w:after="160"/>
+      </w:pPr>
+      <w:r>
+        <w:t xml:space="preserve"/>
+      </w:r>
+    </w:p>
+    <w:p>
+      <w:pPr>
+        <w:pStyle w:val="Heading3"/>
+        <w:spacing w:after="60" w:before="260"/>
+      </w:pPr>
+      <w:r>
+        <w:rPr>
+          <w:b/>
+          <w:bCs/>
+          <w:color w:val="1F3864"/>
+          <w:sz w:val="22"/>
+          <w:szCs w:val="22"/>
+        </w:rPr>
+        <w:t xml:space="preserve">Le renard</w:t>
+      </w:r>
+    </w:p>
+    <w:p>
+      <w:pPr>
         <w:spacing w:after="120" w:before="40"/>
       </w:pPr>
       <w:r>
@@ -934,53 +1060,89 @@
           <w:sz w:val="22"/>
           <w:szCs w:val="22"/>
         </w:rPr>
-        <w:t xml:space="preserve">Le renard</w:t>
-      </w:r>
-    </w:p>
-    <w:p>
-      <w:pPr>
-        <w:spacing w:after="120" w:before="40"/>
-      </w:pPr>
-      <w:r>
-        <w:rPr>
-          <w:i/>
-          <w:iCs/>
-          <w:color w:val="8C8C8C"/>
-          <w:sz w:val="20"/>
-          <w:szCs w:val="20"/>
-        </w:rPr>
-        <w:t xml:space="preserve">À compléter.</w:t>
-      </w:r>
-    </w:p>
-    <w:p>
-      <w:pPr>
-        <w:pStyle w:val="Heading3"/>
-        <w:spacing w:after="60" w:before="260"/>
-      </w:pPr>
-      <w:r>
-        <w:rPr>
-          <w:b/>
-          <w:bCs/>
-          <w:color w:val="1F3864"/>
-          <w:sz w:val="22"/>
-          <w:szCs w:val="22"/>
-        </w:rPr>
         <w:t xml:space="preserve">Le magicien</w:t>
       </w:r>
     </w:p>
     <w:p>
       <w:pPr>
-        <w:spacing w:after="120" w:before="40"/>
-      </w:pPr>
-      <w:r>
-        <w:rPr>
-          <w:i/>
-          <w:iCs/>
-          <w:color w:val="8C8C8C"/>
-          <w:sz w:val="20"/>
-          <w:szCs w:val="20"/>
-        </w:rPr>
-        <w:t xml:space="preserve">À compléter.</w:t>
+        <w:spacing w:after="120" w:before="60" w:line="276"/>
+        <w:jc w:val="both"/>
+      </w:pPr>
+      <w:r>
+        <w:rPr>
+          <w:b/>
+          <w:bCs/>
+        </w:rPr>
+        <w:t xml:space="preserve">L’image. </w:t>
+      </w:r>
+      <w:r>
+        <w:t xml:space="preserve">Le magicien ne l’emporte pas par la force, mais par la surprise : il fait apparaître la balle là où l’adversaire ne l’attend pas.</w:t>
+      </w:r>
+    </w:p>
+    <w:p>
+      <w:pPr>
+        <w:spacing w:after="120" w:before="60" w:line="276"/>
+        <w:jc w:val="both"/>
+      </w:pPr>
+      <w:r>
+        <w:rPr>
+          <w:b/>
+          <w:bCs/>
+        </w:rPr>
+        <w:t xml:space="preserve">Sur le court. </w:t>
+      </w:r>
+      <w:r>
+        <w:t xml:space="preserve">C’est quelqu’un qui est capable de faire des </w:t>
+      </w:r>
+      <w:r>
+        <w:rPr>
+          <w:b/>
+          <w:bCs/>
+        </w:rPr>
+        <w:t xml:space="preserve">amorties</w:t>
+      </w:r>
+      <w:r>
+        <w:t xml:space="preserve">, des </w:t>
+      </w:r>
+      <w:r>
+        <w:rPr>
+          <w:b/>
+          <w:bCs/>
+        </w:rPr>
+        <w:t xml:space="preserve">croisés courts</w:t>
+      </w:r>
+      <w:r>
+        <w:t xml:space="preserve">, l’</w:t>
+      </w:r>
+      <w:r>
+        <w:rPr>
+          <w:b/>
+          <w:bCs/>
+        </w:rPr>
+        <w:t xml:space="preserve">amortie-lob</w:t>
+      </w:r>
+      <w:r>
+        <w:t xml:space="preserve">, des </w:t>
+      </w:r>
+      <w:r>
+        <w:rPr>
+          <w:b/>
+          <w:bCs/>
+        </w:rPr>
+        <w:t xml:space="preserve">slices</w:t>
+      </w:r>
+      <w:r>
+        <w:t xml:space="preserve"> — bref, qui </w:t>
+      </w:r>
+      <w:r>
+        <w:rPr>
+          <w:b/>
+          <w:bCs/>
+        </w:rPr>
+        <w:t xml:space="preserve">varie</w:t>
+      </w:r>
+      <w:r>
+        <w:t xml:space="preserve"> en permanence. C’est par le changement de rythme, de hauteur et de longueur qu’il met l’adversaire en difficulté.</w:t>
       </w:r>
     </w:p>
     <w:p>

</xml_diff>

<commit_message>
Definition du cameleon; les six profils sont renseignes
Cameleon: n'impose pas son jeu, s'adapte a celui de l'adversaire et doit
pouvoir etre tour a tour boa, lion, magicien, mur ou renard.
Retrait du point ouvert sur la description des profils, desormais faite.

Co-Authored-By: Claude Opus 5 <noreply@anthropic.com>
Claude-Session: https://claude.ai/code/session_01MsQTwqEjmEDWzu5z6M6Ayx
</commit_message>
<xml_diff>
--- a/Projet_entrainement.docx
+++ b/Projet_entrainement.docx
@@ -1525,17 +1525,186 @@
     </w:p>
     <w:p>
       <w:pPr>
-        <w:spacing w:after="120" w:before="40"/>
-      </w:pPr>
-      <w:r>
-        <w:rPr>
-          <w:i/>
-          <w:iCs/>
-          <w:color w:val="8C8C8C"/>
-          <w:sz w:val="20"/>
-          <w:szCs w:val="20"/>
-        </w:rPr>
-        <w:t xml:space="preserve">À compléter.</w:t>
+        <w:spacing w:after="120" w:before="60" w:line="276"/>
+        <w:jc w:val="both"/>
+      </w:pPr>
+      <w:r>
+        <w:rPr>
+          <w:b/>
+          <w:bCs/>
+        </w:rPr>
+        <w:t xml:space="preserve">L’image. </w:t>
+      </w:r>
+      <w:r>
+        <w:t xml:space="preserve">Le caméléon prend la couleur de son environnement. Il ne s’impose pas : il s’adapte à ce qu’il trouve en face.</w:t>
+      </w:r>
+    </w:p>
+    <w:p>
+      <w:pPr>
+        <w:spacing w:after="120" w:before="60" w:line="276"/>
+        <w:jc w:val="both"/>
+      </w:pPr>
+      <w:r>
+        <w:rPr>
+          <w:b/>
+          <w:bCs/>
+        </w:rPr>
+        <w:t xml:space="preserve">Sur le court. </w:t>
+      </w:r>
+      <w:r>
+        <w:t xml:space="preserve">Il </w:t>
+      </w:r>
+      <w:r>
+        <w:rPr>
+          <w:b/>
+          <w:bCs/>
+        </w:rPr>
+        <w:t xml:space="preserve">ne va pas imposer son jeu</w:t>
+      </w:r>
+      <w:r>
+        <w:t xml:space="preserve">, il va </w:t>
+      </w:r>
+      <w:r>
+        <w:rPr>
+          <w:b/>
+          <w:bCs/>
+        </w:rPr>
+        <w:t xml:space="preserve">s’adapter au jeu de l’autre</w:t>
+      </w:r>
+      <w:r>
+        <w:t xml:space="preserve">. Il doit donc être capable d’être tour à tour :</w:t>
+      </w:r>
+    </w:p>
+    <w:p>
+      <w:pPr>
+        <w:pStyle w:val="ListParagraph"/>
+        <w:numPr>
+          <w:ilvl w:val="0"/>
+          <w:numId w:val="2"/>
+        </w:numPr>
+        <w:spacing w:after="50" w:before="50" w:line="264"/>
+      </w:pPr>
+      <w:r>
+        <w:t xml:space="preserve">Un boa,</w:t>
+      </w:r>
+    </w:p>
+    <w:p>
+      <w:pPr>
+        <w:pStyle w:val="ListParagraph"/>
+        <w:numPr>
+          <w:ilvl w:val="0"/>
+          <w:numId w:val="2"/>
+        </w:numPr>
+        <w:spacing w:after="50" w:before="50" w:line="264"/>
+      </w:pPr>
+      <w:r>
+        <w:t xml:space="preserve">Un lion,</w:t>
+      </w:r>
+    </w:p>
+    <w:p>
+      <w:pPr>
+        <w:pStyle w:val="ListParagraph"/>
+        <w:numPr>
+          <w:ilvl w:val="0"/>
+          <w:numId w:val="2"/>
+        </w:numPr>
+        <w:spacing w:after="50" w:before="50" w:line="264"/>
+      </w:pPr>
+      <w:r>
+        <w:t xml:space="preserve">Un magicien,</w:t>
+      </w:r>
+    </w:p>
+    <w:p>
+      <w:pPr>
+        <w:pStyle w:val="ListParagraph"/>
+        <w:numPr>
+          <w:ilvl w:val="0"/>
+          <w:numId w:val="2"/>
+        </w:numPr>
+        <w:spacing w:after="50" w:before="50" w:line="264"/>
+      </w:pPr>
+      <w:r>
+        <w:t xml:space="preserve">Un mur,</w:t>
+      </w:r>
+    </w:p>
+    <w:p>
+      <w:pPr>
+        <w:pStyle w:val="ListParagraph"/>
+        <w:numPr>
+          <w:ilvl w:val="0"/>
+          <w:numId w:val="2"/>
+        </w:numPr>
+        <w:spacing w:after="50" w:before="50" w:line="264"/>
+      </w:pPr>
+      <w:r>
+        <w:t xml:space="preserve">Un renard.</w:t>
+      </w:r>
+    </w:p>
+    <w:p>
+      <w:pPr>
+        <w:spacing w:after="120" w:before="60" w:line="276"/>
+        <w:jc w:val="both"/>
+      </w:pPr>
+      <w:r>
+        <w:t xml:space="preserve">Il change en fonction du jeu de l’adversaire : c’est la confrontation qui décide du profil à endosser, et non une préférence fixée à l’avance.</w:t>
+      </w:r>
+    </w:p>
+    <w:tbl>
+      <w:tblPr>
+        <w:tblW w:type="dxa" w:w="9070"/>
+        <w:tblBorders>
+          <w:top w:val="single" w:color="C9D3E6" w:sz="2"/>
+          <w:left w:val="single" w:color="1F3864" w:sz="18"/>
+          <w:bottom w:val="single" w:color="C9D3E6" w:sz="2"/>
+          <w:right w:val="single" w:color="C9D3E6" w:sz="2"/>
+          <w:insideH w:val="none" w:color="FFFFFF" w:sz="0"/>
+          <w:insideV w:val="none" w:color="FFFFFF" w:sz="0"/>
+        </w:tblBorders>
+      </w:tblPr>
+      <w:tblGrid>
+        <w:gridCol w:w="9070"/>
+      </w:tblGrid>
+      <w:tr>
+        <w:tc>
+          <w:tcPr>
+            <w:tcW w:type="dxa" w:w="9070"/>
+            <w:shd w:fill="F2F5FA" w:color="auto" w:val="clear"/>
+            <w:tcMar>
+              <w:top w:type="dxa" w:w="140"/>
+              <w:left w:type="dxa" w:w="180"/>
+              <w:bottom w:type="dxa" w:w="140"/>
+              <w:right w:type="dxa" w:w="180"/>
+            </w:tcMar>
+          </w:tcPr>
+          <w:p>
+            <w:r>
+              <w:rPr>
+                <w:b/>
+                <w:bCs/>
+                <w:color w:val="1F3864"/>
+                <w:sz w:val="20"/>
+                <w:szCs w:val="20"/>
+              </w:rPr>
+              <w:t xml:space="preserve">Son exigence : </w:t>
+            </w:r>
+            <w:r>
+              <w:rPr>
+                <w:color w:val="262626"/>
+                <w:sz w:val="20"/>
+                <w:szCs w:val="20"/>
+              </w:rPr>
+              <w:t xml:space="preserve">le caméléon suppose de maîtriser tous les autres profils — c’est le plus complet, et le plus long à construire.</w:t>
+            </w:r>
+          </w:p>
+        </w:tc>
+      </w:tr>
+    </w:tbl>
+    <w:p>
+      <w:pPr>
+        <w:spacing w:after="160"/>
+      </w:pPr>
+      <w:r>
+        <w:t xml:space="preserve"/>
       </w:r>
     </w:p>
     <w:p>
@@ -2826,19 +2995,6 @@
       </w:pPr>
       <w:r>
         <w:t xml:space="preserve">Calendrier : échelonner les objectifs techniques et tactiques jusqu’à la fin de la préparation.</w:t>
-      </w:r>
-    </w:p>
-    <w:p>
-      <w:pPr>
-        <w:pStyle w:val="ListParagraph"/>
-        <w:numPr>
-          <w:ilvl w:val="0"/>
-          <w:numId w:val="2"/>
-        </w:numPr>
-        <w:spacing w:after="50" w:before="50" w:line="264"/>
-      </w:pPr>
-      <w:r>
-        <w:t xml:space="preserve">Description détaillée des cinq profils du BOA.</w:t>
       </w:r>
     </w:p>
     <w:sectPr>

</xml_diff>

<commit_message>
Nouvelle section 1.5: faire des BOA ascendants
Objectif final: de tres bons boas, mais sans enfermer le joueur dans un
carcan tactique. Exemples de declinaisons (boa ascendant lion, magicien,
renard) et rappel que le boa reste le tronc commun, la coloration venant
de la personnalite de l'enfant.

Co-Authored-By: Claude Opus 5 <noreply@anthropic.com>
Claude-Session: https://claude.ai/code/session_01MsQTwqEjmEDWzu5z6M6Ayx
</commit_message>
<xml_diff>
--- a/Projet_entrainement.docx
+++ b/Projet_entrainement.docx
@@ -1707,6 +1707,222 @@
         <w:t xml:space="preserve"/>
       </w:r>
     </w:p>
+    <w:p>
+      <w:pPr>
+        <w:spacing w:after="160"/>
+      </w:pPr>
+      <w:r>
+        <w:t xml:space="preserve"/>
+      </w:r>
+    </w:p>
+    <w:p>
+      <w:pPr>
+        <w:pStyle w:val="Heading2"/>
+        <w:spacing w:after="80" w:before="240"/>
+      </w:pPr>
+      <w:r>
+        <w:rPr>
+          <w:b/>
+          <w:bCs/>
+          <w:color w:val="1F3864"/>
+          <w:sz w:val="24"/>
+          <w:szCs w:val="24"/>
+        </w:rPr>
+        <w:t xml:space="preserve">1.5 Faire des BOA ascendants</w:t>
+      </w:r>
+    </w:p>
+    <w:p>
+      <w:pPr>
+        <w:spacing w:after="120" w:before="60" w:line="276"/>
+        <w:jc w:val="both"/>
+      </w:pPr>
+      <w:r>
+        <w:t xml:space="preserve">L’objectif final est clair : </w:t>
+      </w:r>
+      <w:r>
+        <w:rPr>
+          <w:b/>
+          <w:bCs/>
+        </w:rPr>
+        <w:t xml:space="preserve">on veut faire de nos joueurs de très bons boas</w:t>
+      </w:r>
+      <w:r>
+        <w:t xml:space="preserve">. Mais il faut </w:t>
+      </w:r>
+      <w:r>
+        <w:rPr>
+          <w:b/>
+          <w:bCs/>
+        </w:rPr>
+        <w:t xml:space="preserve">tenir compte de la personnalité de chaque joueur</w:t>
+      </w:r>
+      <w:r>
+        <w:t xml:space="preserve"> : il ne s’agit pas de les enfermer dans un carcan tactique en leur disant « tu dois être un boa ».</w:t>
+      </w:r>
+    </w:p>
+    <w:p>
+      <w:pPr>
+        <w:spacing w:after="120" w:before="60" w:line="276"/>
+        <w:jc w:val="both"/>
+      </w:pPr>
+      <w:r>
+        <w:t xml:space="preserve">Prenons un exemple. Un joueur est naturellement attiré par le jeu offensif, donc attiré vers le filet. </w:t>
+      </w:r>
+      <w:r>
+        <w:rPr>
+          <w:b/>
+          <w:bCs/>
+        </w:rPr>
+        <w:t xml:space="preserve">Il ne faut surtout pas aller à l’encontre de cela</w:t>
+      </w:r>
+      <w:r>
+        <w:t xml:space="preserve"> en lui disant « non, non, non, tu ne peux pas monter ». On va au contraire essayer d’en faire un </w:t>
+      </w:r>
+      <w:r>
+        <w:rPr>
+          <w:b/>
+          <w:bCs/>
+        </w:rPr>
+        <w:t xml:space="preserve">boa ascendant lion</w:t>
+      </w:r>
+      <w:r>
+        <w:t xml:space="preserve">.</w:t>
+      </w:r>
+    </w:p>
+    <w:p>
+      <w:pPr>
+        <w:spacing w:after="120" w:before="60" w:line="276"/>
+        <w:jc w:val="both"/>
+      </w:pPr>
+      <w:r>
+        <w:t xml:space="preserve">Le même raisonnement vaut pour les autres profils :</w:t>
+      </w:r>
+    </w:p>
+    <w:p>
+      <w:pPr>
+        <w:pStyle w:val="ListParagraph"/>
+        <w:numPr>
+          <w:ilvl w:val="0"/>
+          <w:numId w:val="2"/>
+        </w:numPr>
+        <w:spacing w:after="50" w:before="50" w:line="264"/>
+      </w:pPr>
+      <w:r>
+        <w:t xml:space="preserve">Un joueur qui utilise beaucoup l’amortie et la variation : on en fera un </w:t>
+      </w:r>
+      <w:r>
+        <w:rPr>
+          <w:b/>
+          <w:bCs/>
+        </w:rPr>
+        <w:t xml:space="preserve">boa ascendant magicien</w:t>
+      </w:r>
+      <w:r>
+        <w:t xml:space="preserve">.</w:t>
+      </w:r>
+    </w:p>
+    <w:p>
+      <w:pPr>
+        <w:pStyle w:val="ListParagraph"/>
+        <w:numPr>
+          <w:ilvl w:val="0"/>
+          <w:numId w:val="2"/>
+        </w:numPr>
+        <w:spacing w:after="50" w:before="50" w:line="264"/>
+      </w:pPr>
+      <w:r>
+        <w:t xml:space="preserve">Un joueur qui lit le jeu et cherche la faille : on en fera un </w:t>
+      </w:r>
+      <w:r>
+        <w:rPr>
+          <w:b/>
+          <w:bCs/>
+        </w:rPr>
+        <w:t xml:space="preserve">boa ascendant renard</w:t>
+      </w:r>
+      <w:r>
+        <w:t xml:space="preserve">.</w:t>
+      </w:r>
+    </w:p>
+    <w:p>
+      <w:pPr>
+        <w:spacing w:after="120" w:before="60" w:line="276"/>
+        <w:jc w:val="both"/>
+      </w:pPr>
+      <w:r>
+        <w:t xml:space="preserve">Ce ne sont donc pas des </w:t>
+      </w:r>
+      <w:r>
+        <w:rPr>
+          <w:i/>
+          <w:iCs/>
+        </w:rPr>
+        <w:t xml:space="preserve">purs boas</w:t>
+      </w:r>
+      <w:r>
+        <w:t xml:space="preserve">. Le boa reste le tronc commun — le volume agressif, la solidité, la capacité à conclure — mais la coloration vient de l’enfant. </w:t>
+      </w:r>
+      <w:r>
+        <w:rPr>
+          <w:b/>
+          <w:bCs/>
+        </w:rPr>
+        <w:t xml:space="preserve">Il faut laisser libre cours à sa personnalité</w:t>
+      </w:r>
+      <w:r>
+        <w:t xml:space="preserve">.</w:t>
+      </w:r>
+    </w:p>
+    <w:tbl>
+      <w:tblPr>
+        <w:tblW w:type="dxa" w:w="9070"/>
+        <w:tblBorders>
+          <w:top w:val="single" w:color="C9D3E6" w:sz="2"/>
+          <w:left w:val="single" w:color="1F3864" w:sz="18"/>
+          <w:bottom w:val="single" w:color="C9D3E6" w:sz="2"/>
+          <w:right w:val="single" w:color="C9D3E6" w:sz="2"/>
+          <w:insideH w:val="none" w:color="FFFFFF" w:sz="0"/>
+          <w:insideV w:val="none" w:color="FFFFFF" w:sz="0"/>
+        </w:tblBorders>
+      </w:tblPr>
+      <w:tblGrid>
+        <w:gridCol w:w="9070"/>
+      </w:tblGrid>
+      <w:tr>
+        <w:tc>
+          <w:tcPr>
+            <w:tcW w:type="dxa" w:w="9070"/>
+            <w:shd w:fill="F2F5FA" w:color="auto" w:val="clear"/>
+            <w:tcMar>
+              <w:top w:type="dxa" w:w="140"/>
+              <w:left w:type="dxa" w:w="180"/>
+              <w:bottom w:type="dxa" w:w="140"/>
+              <w:right w:type="dxa" w:w="180"/>
+            </w:tcMar>
+          </w:tcPr>
+          <w:p>
+            <w:r>
+              <w:rPr>
+                <w:b/>
+                <w:bCs/>
+                <w:color w:val="1F3864"/>
+                <w:sz w:val="20"/>
+                <w:szCs w:val="20"/>
+              </w:rPr>
+              <w:t xml:space="preserve">La formule : </w:t>
+            </w:r>
+            <w:r>
+              <w:rPr>
+                <w:color w:val="262626"/>
+                <w:sz w:val="20"/>
+                <w:szCs w:val="20"/>
+              </w:rPr>
+              <w:t xml:space="preserve">un BOA pour tous, une ascendance pour chacun. On construit le boa sans jamais contrarier ce vers quoi l’enfant va naturellement.</w:t>
+            </w:r>
+          </w:p>
+        </w:tc>
+      </w:tr>
+    </w:tbl>
     <w:p>
       <w:pPr>
         <w:spacing w:after="160"/>

</xml_diff>

<commit_message>
Finalisation du chapitre tactique et mise au propre du document
- Renvois de la section 1.1 vers 1.4 et 1.5 pour eviter la redite
- Encadre 2.1 reformule; l'ambiguite "fin de prepa" versee aux points a
  discuter
- Vocabulaire harmonise (le joueur plutot que l'athlete)
- Numerotation des pages en pied de page

Co-Authored-By: Claude Opus 5 <noreply@anthropic.com>
Claude-Session: https://claude.ai/code/session_01MsQTwqEjmEDWzu5z6M6Ayx
</commit_message>
<xml_diff>
--- a/Projet_entrainement.docx
+++ b/Projet_entrainement.docx
@@ -390,7 +390,27 @@
         <w:jc w:val="both"/>
       </w:pPr>
       <w:r>
-        <w:t xml:space="preserve">Le joueur n’a pas à entrer dans un modèle qui n’est pas le sien : c’est le BOA qui s’ajuste à sa personnalité.</w:t>
+        <w:t xml:space="preserve">Le joueur n’a pas à entrer dans un modèle qui n’est pas le sien : c’est le BOA qui s’ajuste à sa personnalité. Chaque profil est défini au </w:t>
+      </w:r>
+      <w:r>
+        <w:rPr>
+          <w:b/>
+          <w:bCs/>
+        </w:rPr>
+        <w:t xml:space="preserve">1.4</w:t>
+      </w:r>
+      <w:r>
+        <w:t xml:space="preserve">, et la manière de le combiner avec le BOA au </w:t>
+      </w:r>
+      <w:r>
+        <w:rPr>
+          <w:b/>
+          <w:bCs/>
+        </w:rPr>
+        <w:t xml:space="preserve">1.5</w:t>
+      </w:r>
+      <w:r>
+        <w:t xml:space="preserve">.</w:t>
       </w:r>
     </w:p>
     <w:p>
@@ -1972,7 +1992,7 @@
         <w:jc w:val="both"/>
       </w:pPr>
       <w:r>
-        <w:t xml:space="preserve">L’objectif n’est pas d’enfermer l’athlète dans un </w:t>
+        <w:t xml:space="preserve">L’objectif n’est pas d’enfermer le joueur dans un </w:t>
       </w:r>
       <w:r>
         <w:rPr>
@@ -2031,7 +2051,7 @@
                 <w:sz w:val="20"/>
                 <w:szCs w:val="20"/>
               </w:rPr>
-              <w:t xml:space="preserve">Objectif échéance : </w:t>
+              <w:t xml:space="preserve">Le repère : </w:t>
             </w:r>
             <w:r>
               <w:rPr>
@@ -2039,7 +2059,7 @@
                 <w:sz w:val="20"/>
                 <w:szCs w:val="20"/>
               </w:rPr>
-              <w:t xml:space="preserve">position des segments correcte à l’impact acquise en fin de préparation.</w:t>
+              <w:t xml:space="preserve">la position des segments à l’impact — préparée dès la fin de la préparation du geste.</w:t>
             </w:r>
           </w:p>
         </w:tc>
@@ -2656,7 +2676,7 @@
         <w:t xml:space="preserve">fixer des objectifs précis</w:t>
       </w:r>
       <w:r>
-        <w:t xml:space="preserve"> avec l’athlète.</w:t>
+        <w:t xml:space="preserve"> avec le joueur.</w:t>
       </w:r>
     </w:p>
     <w:tbl>
@@ -3210,10 +3230,24 @@
         <w:spacing w:after="50" w:before="50" w:line="264"/>
       </w:pPr>
       <w:r>
-        <w:t xml:space="preserve">Calendrier : échelonner les objectifs techniques et tactiques jusqu’à la fin de la préparation.</w:t>
+        <w:t xml:space="preserve">Calendrier : échelonner les objectifs techniques et tactiques d’une saison à l’autre.</w:t>
+      </w:r>
+    </w:p>
+    <w:p>
+      <w:pPr>
+        <w:pStyle w:val="ListParagraph"/>
+        <w:numPr>
+          <w:ilvl w:val="0"/>
+          <w:numId w:val="2"/>
+        </w:numPr>
+        <w:spacing w:after="50" w:before="50" w:line="264"/>
+      </w:pPr>
+      <w:r>
+        <w:t xml:space="preserve">« Fin de prépa » : préciser s’il s’agit de la fin de la phase de préparation du geste ou d’une échéance de la période.</w:t>
       </w:r>
     </w:p>
     <w:sectPr>
+      <w:footerReference w:type="default" r:id="rId7"/>
       <w:pgSz w:w="11906" w:h="16838" w:orient="portrait"/>
       <w:pgMar w:top="1134" w:right="1134" w:bottom="1134" w:left="1134" w:header="708" w:footer="708" w:gutter="0"/>
       <w:pgNumType/>
@@ -3262,6 +3296,27 @@
     </w:p>
   </w:endnote>
 </w:endnotes>
+</file>
+
+<file path=word/footer1.xml><?xml version="1.0" encoding="utf-8"?>
+<w:ftr xmlns:wpc="http://schemas.microsoft.com/office/word/2010/wordprocessingCanvas" xmlns:mc="http://schemas.openxmlformats.org/markup-compatibility/2006" xmlns:o="urn:schemas-microsoft-com:office:office" xmlns:r="http://schemas.openxmlformats.org/officeDocument/2006/relationships" xmlns:m="http://schemas.openxmlformats.org/officeDocument/2006/math" xmlns:v="urn:schemas-microsoft-com:vml" xmlns:wp14="http://schemas.microsoft.com/office/word/2010/wordprocessingDrawing" xmlns:wp="http://schemas.openxmlformats.org/drawingml/2006/wordprocessingDrawing" xmlns:w10="urn:schemas-microsoft-com:office:word" xmlns:w="http://schemas.openxmlformats.org/wordprocessingml/2006/main" xmlns:w14="http://schemas.microsoft.com/office/word/2010/wordml" xmlns:w15="http://schemas.microsoft.com/office/word/2012/wordml" xmlns:wpg="http://schemas.microsoft.com/office/word/2010/wordprocessingGroup" xmlns:wpi="http://schemas.microsoft.com/office/word/2010/wordprocessingInk" xmlns:wne="http://schemas.microsoft.com/office/word/2006/wordml" xmlns:wps="http://schemas.microsoft.com/office/word/2010/wordprocessingShape">
+  <w:p>
+    <w:pPr>
+      <w:jc w:val="center"/>
+    </w:pPr>
+    <w:r>
+      <w:rPr>
+        <w:color w:val="595959"/>
+        <w:sz w:val="18"/>
+        <w:szCs w:val="18"/>
+      </w:rPr>
+      <w:fldChar w:fldCharType="begin"/>
+      <w:instrText xml:space="preserve">PAGE</w:instrText>
+      <w:fldChar w:fldCharType="separate"/>
+      <w:fldChar w:fldCharType="end"/>
+    </w:r>
+  </w:p>
+</w:ftr>
 </file>
 
 <file path=word/footnotes.xml><?xml version="1.0" encoding="utf-8"?>

</xml_diff>